<commit_message>
Tema 1 finalizado e tema 3 adicionado
</commit_message>
<xml_diff>
--- a/QUESTÕES DISSERTATIVAS/TEMA 1.docx
+++ b/QUESTÕES DISSERTATIVAS/TEMA 1.docx
@@ -63,12 +63,13 @@
     <w:tbl>
       <w:tblPr>
         <w:tblStyle w:val="SimplesTabela1"/>
-        <w:tblW w:w="9317" w:type="dxa"/>
+        <w:tblW w:w="10958" w:type="dxa"/>
+        <w:tblInd w:w="-1231" w:type="dxa"/>
         <w:tblLook w:val="04A0" w:firstRow="1" w:lastRow="0" w:firstColumn="1" w:lastColumn="0" w:noHBand="0" w:noVBand="1"/>
       </w:tblPr>
       <w:tblGrid>
-        <w:gridCol w:w="2338"/>
-        <w:gridCol w:w="6979"/>
+        <w:gridCol w:w="2238"/>
+        <w:gridCol w:w="8720"/>
       </w:tblGrid>
       <w:tr>
         <w:trPr>
@@ -133,10 +134,7 @@
               <w:cnfStyle w:val="000000100000" w:firstRow="0" w:lastRow="0" w:firstColumn="0" w:lastColumn="0" w:oddVBand="0" w:evenVBand="0" w:oddHBand="1" w:evenHBand="0" w:firstRowFirstColumn="0" w:firstRowLastColumn="0" w:lastRowFirstColumn="0" w:lastRowLastColumn="0"/>
             </w:pPr>
             <w:r>
-              <w:t>E</w:t>
-            </w:r>
-            <w:r>
-              <w:t>ditar o evento com todos os campos preenchidos</w:t>
+              <w:t>ADICIONAR EVENTO COM TODOS OS CAMPOS PREENCHIDOS</w:t>
             </w:r>
           </w:p>
         </w:tc>
@@ -169,10 +167,13 @@
               <w:cnfStyle w:val="000000000000" w:firstRow="0" w:lastRow="0" w:firstColumn="0" w:lastColumn="0" w:oddVBand="0" w:evenVBand="0" w:oddHBand="0" w:evenHBand="0" w:firstRowFirstColumn="0" w:firstRowLastColumn="0" w:lastRowFirstColumn="0" w:lastRowLastColumn="0"/>
             </w:pPr>
             <w:r>
-              <w:t>A</w:t>
-            </w:r>
-            <w:r>
-              <w:t>genda – Cadastro de Evento</w:t>
+              <w:t>GOOGLE AGENDA</w:t>
+            </w:r>
+            <w:r>
+              <w:t xml:space="preserve"> – CADASTRO</w:t>
+            </w:r>
+            <w:r>
+              <w:t xml:space="preserve"> DE EVENTO</w:t>
             </w:r>
           </w:p>
         </w:tc>
@@ -224,13 +225,25 @@
               <w:t>suário estar logado no sistema</w:t>
             </w:r>
             <w:r>
-              <w:t xml:space="preserve">. 2- A tela de consulta de eventos está aberta. 3- </w:t>
-            </w:r>
-            <w:r>
-              <w:t>Localizar o event</w:t>
-            </w:r>
-            <w:r>
-              <w:t>o já cadastrado no dia 14/04/2026</w:t>
+              <w:t xml:space="preserve">. 2- A tela de </w:t>
+            </w:r>
+            <w:r>
+              <w:t xml:space="preserve">agenda </w:t>
+            </w:r>
+            <w:r>
+              <w:t>est</w:t>
+            </w:r>
+            <w:r>
+              <w:t>ar</w:t>
+            </w:r>
+            <w:r>
+              <w:t xml:space="preserve"> aberta. 3- </w:t>
+            </w:r>
+            <w:r>
+              <w:t xml:space="preserve">Localizar o </w:t>
+            </w:r>
+            <w:r>
+              <w:t>botão Criar no canto superior direito</w:t>
             </w:r>
           </w:p>
         </w:tc>
@@ -275,7 +288,31 @@
               <w:t xml:space="preserve">Clicar no </w:t>
             </w:r>
             <w:r>
-              <w:t xml:space="preserve">botão “Editar Evento”. 2 </w:t>
+              <w:t>botão “</w:t>
+            </w:r>
+            <w:r>
+              <w:t>Criar</w:t>
+            </w:r>
+            <w:r>
+              <w:t>”</w:t>
+            </w:r>
+            <w:r>
+              <w:t xml:space="preserve"> e </w:t>
+            </w:r>
+            <w:r>
+              <w:t>2- Clicar em “</w:t>
+            </w:r>
+            <w:r>
+              <w:t>Evento”</w:t>
+            </w:r>
+            <w:r>
+              <w:t xml:space="preserve">. </w:t>
+            </w:r>
+            <w:r>
+              <w:t>3</w:t>
+            </w:r>
+            <w:r>
+              <w:t xml:space="preserve"> </w:t>
             </w:r>
             <w:r>
               <w:t>–</w:t>
@@ -284,13 +321,43 @@
               <w:t xml:space="preserve"> </w:t>
             </w:r>
             <w:r>
-              <w:t>Modicar o título para “Evento principal”</w:t>
-            </w:r>
-            <w:r>
-              <w:t xml:space="preserve">. 3 – Manter a data como 14/06/2026. </w:t>
-            </w:r>
-            <w:r>
-              <w:t xml:space="preserve">4 – Modificar </w:t>
+              <w:t>Preencher o campo adicionar título com “Evento principal</w:t>
+            </w:r>
+            <w:r>
+              <w:t>”</w:t>
+            </w:r>
+            <w:r>
+              <w:t xml:space="preserve">. </w:t>
+            </w:r>
+            <w:r>
+              <w:t>4 –</w:t>
+            </w:r>
+            <w:r>
+              <w:t xml:space="preserve">Preencher data com </w:t>
+            </w:r>
+            <w:r>
+              <w:t>“</w:t>
+            </w:r>
+            <w:r>
+              <w:t>04/17/2026</w:t>
+            </w:r>
+            <w:r>
+              <w:t>”</w:t>
+            </w:r>
+            <w:r>
+              <w:t xml:space="preserve">. </w:t>
+            </w:r>
+            <w:r>
+              <w:t>5</w:t>
+            </w:r>
+            <w:r>
+              <w:t xml:space="preserve"> – </w:t>
+            </w:r>
+            <w:r>
+              <w:t>Preencher</w:t>
+            </w:r>
+            <w:r>
+              <w:t xml:space="preserve"> </w:t>
             </w:r>
             <w:r>
               <w:t>o horário</w:t>
@@ -305,28 +372,67 @@
               <w:t xml:space="preserve"> início</w:t>
             </w:r>
             <w:r>
-              <w:t xml:space="preserve"> das 11:30 </w:t>
-            </w:r>
-            <w:r>
-              <w:t>para</w:t>
-            </w:r>
-            <w:r>
-              <w:t xml:space="preserve"> 12:45</w:t>
-            </w:r>
-            <w:r>
-              <w:t xml:space="preserve">. 5 – Modificar </w:t>
+              <w:t xml:space="preserve"> </w:t>
+            </w:r>
+            <w:r>
+              <w:t xml:space="preserve">com </w:t>
+            </w:r>
+            <w:r>
+              <w:t>“</w:t>
+            </w:r>
+            <w:r>
+              <w:t>11:30</w:t>
+            </w:r>
+            <w:r>
+              <w:t xml:space="preserve"> am</w:t>
+            </w:r>
+            <w:r>
+              <w:t>”.</w:t>
+            </w:r>
+            <w:r>
+              <w:t xml:space="preserve"> </w:t>
+            </w:r>
+            <w:r>
+              <w:t>6</w:t>
+            </w:r>
+            <w:r>
+              <w:t xml:space="preserve"> – </w:t>
+            </w:r>
+            <w:r>
+              <w:t xml:space="preserve">Preencher </w:t>
             </w:r>
             <w:r>
               <w:t xml:space="preserve">o </w:t>
             </w:r>
             <w:r>
-              <w:t xml:space="preserve">horário de término das 13:00 para 14:30. 6 – Inserir em local que antes estava em branco </w:t>
-            </w:r>
-            <w:r>
-              <w:t>Parque Ibirapuera</w:t>
-            </w:r>
-            <w:r>
-              <w:t>. 7 – Clicar no botão “Salvar”</w:t>
+              <w:t xml:space="preserve">horário de término das </w:t>
+            </w:r>
+            <w:r>
+              <w:t>“</w:t>
+            </w:r>
+            <w:r>
+              <w:t>1:</w:t>
+            </w:r>
+            <w:r>
+              <w:t>3</w:t>
+            </w:r>
+            <w:r>
+              <w:t>0</w:t>
+            </w:r>
+            <w:r>
+              <w:t xml:space="preserve"> pm</w:t>
+            </w:r>
+            <w:r>
+              <w:t>”</w:t>
+            </w:r>
+            <w:r>
+              <w:t xml:space="preserve">. </w:t>
+            </w:r>
+            <w:r>
+              <w:t>6 –</w:t>
+            </w:r>
+            <w:r>
+              <w:t xml:space="preserve"> Clicar no botão “Salvar”</w:t>
             </w:r>
           </w:p>
         </w:tc>
@@ -359,6 +465,12 @@
               <w:jc w:val="both"/>
               <w:cnfStyle w:val="000000100000" w:firstRow="0" w:lastRow="0" w:firstColumn="0" w:lastColumn="0" w:oddVBand="0" w:evenVBand="0" w:oddHBand="1" w:evenHBand="0" w:firstRowFirstColumn="0" w:firstRowLastColumn="0" w:lastRowFirstColumn="0" w:lastRowLastColumn="0"/>
             </w:pPr>
+            <w:r>
+              <w:t xml:space="preserve">Título: Evento principal, Data: 04/17/2026, Hora Início </w:t>
+            </w:r>
+            <w:r>
+              <w:t>11:30 am, Hora Final: 1:30 pm.</w:t>
+            </w:r>
           </w:p>
         </w:tc>
       </w:tr>
@@ -389,6 +501,9 @@
               <w:jc w:val="both"/>
               <w:cnfStyle w:val="000000000000" w:firstRow="0" w:lastRow="0" w:firstColumn="0" w:lastColumn="0" w:oddVBand="0" w:evenVBand="0" w:oddHBand="0" w:evenHBand="0" w:firstRowFirstColumn="0" w:firstRowLastColumn="0" w:lastRowFirstColumn="0" w:lastRowLastColumn="0"/>
             </w:pPr>
+            <w:r>
+              <w:t>O evento é salvo com sucesso e aparece na agenda do dia 17/04/2026 com todas as informações preenchidas</w:t>
+            </w:r>
           </w:p>
         </w:tc>
       </w:tr>
@@ -420,6 +535,12 @@
               <w:jc w:val="both"/>
               <w:cnfStyle w:val="000000100000" w:firstRow="0" w:lastRow="0" w:firstColumn="0" w:lastColumn="0" w:oddVBand="0" w:evenVBand="0" w:oddHBand="1" w:evenHBand="0" w:firstRowFirstColumn="0" w:firstRowLastColumn="0" w:lastRowFirstColumn="0" w:lastRowLastColumn="0"/>
             </w:pPr>
+            <w:r>
+              <w:t xml:space="preserve">Evento </w:t>
+            </w:r>
+            <w:r>
+              <w:t>salvo</w:t>
+            </w:r>
           </w:p>
         </w:tc>
       </w:tr>
@@ -450,6 +571,9 @@
               <w:jc w:val="both"/>
               <w:cnfStyle w:val="000000000000" w:firstRow="0" w:lastRow="0" w:firstColumn="0" w:lastColumn="0" w:oddVBand="0" w:evenVBand="0" w:oddHBand="0" w:evenHBand="0" w:firstRowFirstColumn="0" w:firstRowLastColumn="0" w:lastRowFirstColumn="0" w:lastRowLastColumn="0"/>
             </w:pPr>
+            <w:r>
+              <w:t>[x] passou</w:t>
+            </w:r>
           </w:p>
         </w:tc>
       </w:tr>
@@ -481,6 +605,29 @@
               <w:jc w:val="both"/>
               <w:cnfStyle w:val="000000100000" w:firstRow="0" w:lastRow="0" w:firstColumn="0" w:lastColumn="0" w:oddVBand="0" w:evenVBand="0" w:oddHBand="1" w:evenHBand="0" w:firstRowFirstColumn="0" w:firstRowLastColumn="0" w:lastRowFirstColumn="0" w:lastRowLastColumn="0"/>
             </w:pPr>
+            <w:r>
+              <w:t xml:space="preserve">Sistema operacional: Windows 11 Navegador: </w:t>
+            </w:r>
+            <w:r>
+              <w:t xml:space="preserve">Microsoft Edge </w:t>
+            </w:r>
+            <w:r>
+              <w:t>147.0.3912.60</w:t>
+            </w:r>
+            <w:r>
+              <w:t xml:space="preserve"> A</w:t>
+            </w:r>
+            <w:r>
+              <w:t xml:space="preserve">mbiente: </w:t>
+            </w:r>
+            <w:hyperlink r:id="rId5" w:history="1">
+              <w:r>
+                <w:rPr>
+                  <w:rStyle w:val="Hyperlink"/>
+                </w:rPr>
+                <w:t>Google Agenda - Semana de 12 de abril de 2026</w:t>
+              </w:r>
+            </w:hyperlink>
           </w:p>
         </w:tc>
       </w:tr>
@@ -498,6 +645,7 @@
               <w:jc w:val="both"/>
             </w:pPr>
             <w:r>
+              <w:lastRenderedPageBreak/>
               <w:t>EVICÊNCIAS</w:t>
             </w:r>
           </w:p>
@@ -511,6 +659,43 @@
               <w:jc w:val="both"/>
               <w:cnfStyle w:val="000000000000" w:firstRow="0" w:lastRow="0" w:firstColumn="0" w:lastColumn="0" w:oddVBand="0" w:evenVBand="0" w:oddHBand="0" w:evenHBand="0" w:firstRowFirstColumn="0" w:firstRowLastColumn="0" w:lastRowFirstColumn="0" w:lastRowLastColumn="0"/>
             </w:pPr>
+            <w:r>
+              <w:drawing>
+                <wp:inline distT="0" distB="0" distL="0" distR="0" wp14:anchorId="5536D884" wp14:editId="341D24CF">
+                  <wp:extent cx="5400040" cy="2526030"/>
+                  <wp:effectExtent l="0" t="0" r="0" b="7620"/>
+                  <wp:docPr id="151124343" name="Imagem 1"/>
+                  <wp:cNvGraphicFramePr>
+                    <a:graphicFrameLocks xmlns:a="http://schemas.openxmlformats.org/drawingml/2006/main" noChangeAspect="1"/>
+                  </wp:cNvGraphicFramePr>
+                  <a:graphic xmlns:a="http://schemas.openxmlformats.org/drawingml/2006/main">
+                    <a:graphicData uri="http://schemas.openxmlformats.org/drawingml/2006/picture">
+                      <pic:pic xmlns:pic="http://schemas.openxmlformats.org/drawingml/2006/picture">
+                        <pic:nvPicPr>
+                          <pic:cNvPr id="151124343" name=""/>
+                          <pic:cNvPicPr/>
+                        </pic:nvPicPr>
+                        <pic:blipFill>
+                          <a:blip r:embed="rId6"/>
+                          <a:stretch>
+                            <a:fillRect/>
+                          </a:stretch>
+                        </pic:blipFill>
+                        <pic:spPr>
+                          <a:xfrm>
+                            <a:off x="0" y="0"/>
+                            <a:ext cx="5400040" cy="2526030"/>
+                          </a:xfrm>
+                          <a:prstGeom prst="rect">
+                            <a:avLst/>
+                          </a:prstGeom>
+                        </pic:spPr>
+                      </pic:pic>
+                    </a:graphicData>
+                  </a:graphic>
+                </wp:inline>
+              </w:drawing>
+            </w:r>
           </w:p>
         </w:tc>
       </w:tr>
@@ -542,10 +727,1645 @@
               <w:jc w:val="both"/>
               <w:cnfStyle w:val="000000100000" w:firstRow="0" w:lastRow="0" w:firstColumn="0" w:lastColumn="0" w:oddVBand="0" w:evenVBand="0" w:oddHBand="1" w:evenHBand="0" w:firstRowFirstColumn="0" w:firstRowLastColumn="0" w:lastRowFirstColumn="0" w:lastRowLastColumn="0"/>
             </w:pPr>
+            <w:r>
+              <w:t>Não</w:t>
+            </w:r>
           </w:p>
         </w:tc>
       </w:tr>
     </w:tbl>
+    <w:p>
+      <w:pPr>
+        <w:jc w:val="both"/>
+      </w:pPr>
+    </w:p>
+    <w:tbl>
+      <w:tblPr>
+        <w:tblStyle w:val="SimplesTabela1"/>
+        <w:tblW w:w="10958" w:type="dxa"/>
+        <w:tblInd w:w="-1231" w:type="dxa"/>
+        <w:tblLook w:val="04A0" w:firstRow="1" w:lastRow="0" w:firstColumn="1" w:lastColumn="0" w:noHBand="0" w:noVBand="1"/>
+      </w:tblPr>
+      <w:tblGrid>
+        <w:gridCol w:w="2238"/>
+        <w:gridCol w:w="8720"/>
+      </w:tblGrid>
+      <w:tr>
+        <w:trPr>
+          <w:cnfStyle w:val="100000000000" w:firstRow="1" w:lastRow="0" w:firstColumn="0" w:lastColumn="0" w:oddVBand="0" w:evenVBand="0" w:oddHBand="0" w:evenHBand="0" w:firstRowFirstColumn="0" w:firstRowLastColumn="0" w:lastRowFirstColumn="0" w:lastRowLastColumn="0"/>
+          <w:trHeight w:val="317"/>
+        </w:trPr>
+        <w:tc>
+          <w:tcPr>
+            <w:cnfStyle w:val="001000000000" w:firstRow="0" w:lastRow="0" w:firstColumn="1" w:lastColumn="0" w:oddVBand="0" w:evenVBand="0" w:oddHBand="0" w:evenHBand="0" w:firstRowFirstColumn="0" w:firstRowLastColumn="0" w:lastRowFirstColumn="0" w:lastRowLastColumn="0"/>
+            <w:tcW w:w="0" w:type="auto"/>
+          </w:tcPr>
+          <w:p>
+            <w:pPr>
+              <w:jc w:val="both"/>
+            </w:pPr>
+            <w:r>
+              <w:t>ID</w:t>
+            </w:r>
+          </w:p>
+        </w:tc>
+        <w:tc>
+          <w:tcPr>
+            <w:tcW w:w="0" w:type="auto"/>
+          </w:tcPr>
+          <w:p>
+            <w:pPr>
+              <w:jc w:val="both"/>
+              <w:cnfStyle w:val="100000000000" w:firstRow="1" w:lastRow="0" w:firstColumn="0" w:lastColumn="0" w:oddVBand="0" w:evenVBand="0" w:oddHBand="0" w:evenHBand="0" w:firstRowFirstColumn="0" w:firstRowLastColumn="0" w:lastRowFirstColumn="0" w:lastRowLastColumn="0"/>
+            </w:pPr>
+            <w:r>
+              <w:t>CT 0</w:t>
+            </w:r>
+            <w:r>
+              <w:t>2</w:t>
+            </w:r>
+          </w:p>
+        </w:tc>
+      </w:tr>
+      <w:tr>
+        <w:trPr>
+          <w:cnfStyle w:val="000000100000" w:firstRow="0" w:lastRow="0" w:firstColumn="0" w:lastColumn="0" w:oddVBand="0" w:evenVBand="0" w:oddHBand="1" w:evenHBand="0" w:firstRowFirstColumn="0" w:firstRowLastColumn="0" w:lastRowFirstColumn="0" w:lastRowLastColumn="0"/>
+          <w:trHeight w:val="317"/>
+        </w:trPr>
+        <w:tc>
+          <w:tcPr>
+            <w:cnfStyle w:val="001000000000" w:firstRow="0" w:lastRow="0" w:firstColumn="1" w:lastColumn="0" w:oddVBand="0" w:evenVBand="0" w:oddHBand="0" w:evenHBand="0" w:firstRowFirstColumn="0" w:firstRowLastColumn="0" w:lastRowFirstColumn="0" w:lastRowLastColumn="0"/>
+            <w:tcW w:w="0" w:type="auto"/>
+          </w:tcPr>
+          <w:p>
+            <w:pPr>
+              <w:jc w:val="both"/>
+            </w:pPr>
+            <w:r>
+              <w:t>TÍTULO</w:t>
+            </w:r>
+          </w:p>
+        </w:tc>
+        <w:tc>
+          <w:tcPr>
+            <w:tcW w:w="0" w:type="auto"/>
+          </w:tcPr>
+          <w:p>
+            <w:pPr>
+              <w:jc w:val="both"/>
+              <w:cnfStyle w:val="000000100000" w:firstRow="0" w:lastRow="0" w:firstColumn="0" w:lastColumn="0" w:oddVBand="0" w:evenVBand="0" w:oddHBand="1" w:evenHBand="0" w:firstRowFirstColumn="0" w:firstRowLastColumn="0" w:lastRowFirstColumn="0" w:lastRowLastColumn="0"/>
+            </w:pPr>
+            <w:r>
+              <w:t xml:space="preserve">EDITAR </w:t>
+            </w:r>
+            <w:r>
+              <w:t>EVENTO COM TODOS OS CAMPOS PREENCHIDOS</w:t>
+            </w:r>
+          </w:p>
+        </w:tc>
+      </w:tr>
+      <w:tr>
+        <w:trPr>
+          <w:trHeight w:val="330"/>
+        </w:trPr>
+        <w:tc>
+          <w:tcPr>
+            <w:cnfStyle w:val="001000000000" w:firstRow="0" w:lastRow="0" w:firstColumn="1" w:lastColumn="0" w:oddVBand="0" w:evenVBand="0" w:oddHBand="0" w:evenHBand="0" w:firstRowFirstColumn="0" w:firstRowLastColumn="0" w:lastRowFirstColumn="0" w:lastRowLastColumn="0"/>
+            <w:tcW w:w="0" w:type="auto"/>
+          </w:tcPr>
+          <w:p>
+            <w:pPr>
+              <w:jc w:val="both"/>
+            </w:pPr>
+            <w:r>
+              <w:t>FUNCIONALIDADE</w:t>
+            </w:r>
+          </w:p>
+        </w:tc>
+        <w:tc>
+          <w:tcPr>
+            <w:tcW w:w="0" w:type="auto"/>
+          </w:tcPr>
+          <w:p>
+            <w:pPr>
+              <w:jc w:val="both"/>
+              <w:cnfStyle w:val="000000000000" w:firstRow="0" w:lastRow="0" w:firstColumn="0" w:lastColumn="0" w:oddVBand="0" w:evenVBand="0" w:oddHBand="0" w:evenHBand="0" w:firstRowFirstColumn="0" w:firstRowLastColumn="0" w:lastRowFirstColumn="0" w:lastRowLastColumn="0"/>
+            </w:pPr>
+            <w:r>
+              <w:t>GOOGLE AGENDA</w:t>
+            </w:r>
+            <w:r>
+              <w:t xml:space="preserve"> – EDITAR EVENDO</w:t>
+            </w:r>
+          </w:p>
+        </w:tc>
+      </w:tr>
+      <w:tr>
+        <w:trPr>
+          <w:cnfStyle w:val="000000100000" w:firstRow="0" w:lastRow="0" w:firstColumn="0" w:lastColumn="0" w:oddVBand="0" w:evenVBand="0" w:oddHBand="1" w:evenHBand="0" w:firstRowFirstColumn="0" w:firstRowLastColumn="0" w:lastRowFirstColumn="0" w:lastRowLastColumn="0"/>
+          <w:trHeight w:val="317"/>
+        </w:trPr>
+        <w:tc>
+          <w:tcPr>
+            <w:cnfStyle w:val="001000000000" w:firstRow="0" w:lastRow="0" w:firstColumn="1" w:lastColumn="0" w:oddVBand="0" w:evenVBand="0" w:oddHBand="0" w:evenHBand="0" w:firstRowFirstColumn="0" w:firstRowLastColumn="0" w:lastRowFirstColumn="0" w:lastRowLastColumn="0"/>
+            <w:tcW w:w="0" w:type="auto"/>
+          </w:tcPr>
+          <w:p>
+            <w:pPr>
+              <w:jc w:val="both"/>
+            </w:pPr>
+            <w:r>
+              <w:t>PRÉ-CONDIÇÕES</w:t>
+            </w:r>
+          </w:p>
+        </w:tc>
+        <w:tc>
+          <w:tcPr>
+            <w:tcW w:w="0" w:type="auto"/>
+          </w:tcPr>
+          <w:p>
+            <w:pPr>
+              <w:jc w:val="both"/>
+              <w:cnfStyle w:val="000000100000" w:firstRow="0" w:lastRow="0" w:firstColumn="0" w:lastColumn="0" w:oddVBand="0" w:evenVBand="0" w:oddHBand="1" w:evenHBand="0" w:firstRowFirstColumn="0" w:firstRowLastColumn="0" w:lastRowFirstColumn="0" w:lastRowLastColumn="0"/>
+            </w:pPr>
+            <w:r>
+              <w:t xml:space="preserve">1 - Usuário estar logado no sistema. 2- A tela de agenda estar aberta. 3- Localizar o </w:t>
+            </w:r>
+            <w:r>
+              <w:t xml:space="preserve">evento que o usuário deseja </w:t>
+            </w:r>
+            <w:r>
+              <w:t>editar</w:t>
+            </w:r>
+          </w:p>
+        </w:tc>
+      </w:tr>
+      <w:tr>
+        <w:trPr>
+          <w:trHeight w:val="317"/>
+        </w:trPr>
+        <w:tc>
+          <w:tcPr>
+            <w:cnfStyle w:val="001000000000" w:firstRow="0" w:lastRow="0" w:firstColumn="1" w:lastColumn="0" w:oddVBand="0" w:evenVBand="0" w:oddHBand="0" w:evenHBand="0" w:firstRowFirstColumn="0" w:firstRowLastColumn="0" w:lastRowFirstColumn="0" w:lastRowLastColumn="0"/>
+            <w:tcW w:w="0" w:type="auto"/>
+          </w:tcPr>
+          <w:p>
+            <w:pPr>
+              <w:jc w:val="both"/>
+            </w:pPr>
+            <w:r>
+              <w:t>PASSOS</w:t>
+            </w:r>
+          </w:p>
+        </w:tc>
+        <w:tc>
+          <w:tcPr>
+            <w:tcW w:w="0" w:type="auto"/>
+          </w:tcPr>
+          <w:p>
+            <w:pPr>
+              <w:jc w:val="both"/>
+              <w:cnfStyle w:val="000000000000" w:firstRow="0" w:lastRow="0" w:firstColumn="0" w:lastColumn="0" w:oddVBand="0" w:evenVBand="0" w:oddHBand="0" w:evenHBand="0" w:firstRowFirstColumn="0" w:firstRowLastColumn="0" w:lastRowFirstColumn="0" w:lastRowLastColumn="0"/>
+            </w:pPr>
+            <w:r>
+              <w:t xml:space="preserve">1 </w:t>
+            </w:r>
+            <w:r>
+              <w:t>–</w:t>
+            </w:r>
+            <w:r>
+              <w:t xml:space="preserve"> </w:t>
+            </w:r>
+            <w:r>
+              <w:t>Localizar o Evento principal agendado para o dia 17/04/2026 às 11:3</w:t>
+            </w:r>
+            <w:r>
+              <w:t>0 am</w:t>
+            </w:r>
+            <w:r>
+              <w:t xml:space="preserve">. 2 - </w:t>
+            </w:r>
+            <w:r>
+              <w:t>Clicar no</w:t>
+            </w:r>
+            <w:r>
+              <w:t xml:space="preserve"> evento</w:t>
+            </w:r>
+            <w:r>
+              <w:t xml:space="preserve"> “</w:t>
+            </w:r>
+            <w:r>
+              <w:t>Evento principal</w:t>
+            </w:r>
+            <w:r>
+              <w:t>”</w:t>
+            </w:r>
+            <w:r>
+              <w:t xml:space="preserve"> </w:t>
+            </w:r>
+            <w:r>
+              <w:t>3 - L</w:t>
+            </w:r>
+            <w:r>
+              <w:t xml:space="preserve">ocalizar o lápis e clicar. </w:t>
+            </w:r>
+            <w:r>
+              <w:t>4</w:t>
+            </w:r>
+            <w:r>
+              <w:t xml:space="preserve"> – Permanecer o título do evento. </w:t>
+            </w:r>
+            <w:r>
+              <w:t>5</w:t>
+            </w:r>
+            <w:r>
+              <w:t xml:space="preserve"> –</w:t>
+            </w:r>
+            <w:r>
+              <w:t xml:space="preserve"> Permanecer</w:t>
+            </w:r>
+            <w:r>
+              <w:t xml:space="preserve"> a</w:t>
+            </w:r>
+            <w:r>
+              <w:t xml:space="preserve"> dat</w:t>
+            </w:r>
+            <w:r>
+              <w:t>a.</w:t>
+            </w:r>
+            <w:r>
+              <w:t xml:space="preserve"> </w:t>
+            </w:r>
+            <w:r>
+              <w:t>6</w:t>
+            </w:r>
+            <w:r>
+              <w:t xml:space="preserve"> – </w:t>
+            </w:r>
+            <w:r>
+              <w:t>Alterar</w:t>
+            </w:r>
+            <w:r>
+              <w:t xml:space="preserve"> o horário de início com “</w:t>
+            </w:r>
+            <w:r>
+              <w:t>1</w:t>
+            </w:r>
+            <w:r>
+              <w:t xml:space="preserve">:30 am”. </w:t>
+            </w:r>
+            <w:r>
+              <w:t>7</w:t>
+            </w:r>
+            <w:r>
+              <w:t xml:space="preserve"> – </w:t>
+            </w:r>
+            <w:r>
+              <w:t>Alterar</w:t>
+            </w:r>
+            <w:r>
+              <w:t xml:space="preserve"> o horário de término </w:t>
+            </w:r>
+            <w:r>
+              <w:t>para</w:t>
+            </w:r>
+            <w:r>
+              <w:t xml:space="preserve"> “</w:t>
+            </w:r>
+            <w:r>
+              <w:t>3</w:t>
+            </w:r>
+            <w:r>
+              <w:t xml:space="preserve">:30 pm”. </w:t>
+            </w:r>
+            <w:r>
+              <w:t>8</w:t>
+            </w:r>
+            <w:r>
+              <w:t xml:space="preserve"> – Clicar no botão “Salvar”</w:t>
+            </w:r>
+          </w:p>
+        </w:tc>
+      </w:tr>
+      <w:tr>
+        <w:trPr>
+          <w:cnfStyle w:val="000000100000" w:firstRow="0" w:lastRow="0" w:firstColumn="0" w:lastColumn="0" w:oddVBand="0" w:evenVBand="0" w:oddHBand="1" w:evenHBand="0" w:firstRowFirstColumn="0" w:firstRowLastColumn="0" w:lastRowFirstColumn="0" w:lastRowLastColumn="0"/>
+          <w:trHeight w:val="317"/>
+        </w:trPr>
+        <w:tc>
+          <w:tcPr>
+            <w:cnfStyle w:val="001000000000" w:firstRow="0" w:lastRow="0" w:firstColumn="1" w:lastColumn="0" w:oddVBand="0" w:evenVBand="0" w:oddHBand="0" w:evenHBand="0" w:firstRowFirstColumn="0" w:firstRowLastColumn="0" w:lastRowFirstColumn="0" w:lastRowLastColumn="0"/>
+            <w:tcW w:w="0" w:type="auto"/>
+          </w:tcPr>
+          <w:p>
+            <w:pPr>
+              <w:jc w:val="both"/>
+            </w:pPr>
+            <w:r>
+              <w:t>DADOS DE ENTRADA</w:t>
+            </w:r>
+          </w:p>
+        </w:tc>
+        <w:tc>
+          <w:tcPr>
+            <w:tcW w:w="0" w:type="auto"/>
+          </w:tcPr>
+          <w:p>
+            <w:pPr>
+              <w:jc w:val="both"/>
+              <w:cnfStyle w:val="000000100000" w:firstRow="0" w:lastRow="0" w:firstColumn="0" w:lastColumn="0" w:oddVBand="0" w:evenVBand="0" w:oddHBand="1" w:evenHBand="0" w:firstRowFirstColumn="0" w:firstRowLastColumn="0" w:lastRowFirstColumn="0" w:lastRowLastColumn="0"/>
+            </w:pPr>
+            <w:r>
+              <w:t xml:space="preserve">Título: Evento principal, Data: 04/17/2026, Hora Início 1:30 am, Hora Final: </w:t>
+            </w:r>
+            <w:r>
+              <w:t>3</w:t>
+            </w:r>
+            <w:r>
+              <w:t>:30 pm.</w:t>
+            </w:r>
+          </w:p>
+        </w:tc>
+      </w:tr>
+      <w:tr>
+        <w:trPr>
+          <w:trHeight w:val="330"/>
+        </w:trPr>
+        <w:tc>
+          <w:tcPr>
+            <w:cnfStyle w:val="001000000000" w:firstRow="0" w:lastRow="0" w:firstColumn="1" w:lastColumn="0" w:oddVBand="0" w:evenVBand="0" w:oddHBand="0" w:evenHBand="0" w:firstRowFirstColumn="0" w:firstRowLastColumn="0" w:lastRowFirstColumn="0" w:lastRowLastColumn="0"/>
+            <w:tcW w:w="0" w:type="auto"/>
+          </w:tcPr>
+          <w:p>
+            <w:pPr>
+              <w:jc w:val="both"/>
+            </w:pPr>
+            <w:r>
+              <w:t>RESULTADO ESPERADO</w:t>
+            </w:r>
+          </w:p>
+        </w:tc>
+        <w:tc>
+          <w:tcPr>
+            <w:tcW w:w="0" w:type="auto"/>
+          </w:tcPr>
+          <w:p>
+            <w:pPr>
+              <w:jc w:val="both"/>
+              <w:cnfStyle w:val="000000000000" w:firstRow="0" w:lastRow="0" w:firstColumn="0" w:lastColumn="0" w:oddVBand="0" w:evenVBand="0" w:oddHBand="0" w:evenHBand="0" w:firstRowFirstColumn="0" w:firstRowLastColumn="0" w:lastRowFirstColumn="0" w:lastRowLastColumn="0"/>
+            </w:pPr>
+            <w:r>
+              <w:t xml:space="preserve">O </w:t>
+            </w:r>
+            <w:r>
+              <w:t xml:space="preserve">evento </w:t>
+            </w:r>
+            <w:r>
+              <w:t xml:space="preserve">é alterado com sucesso continua aparecendo na agenda do dia </w:t>
+            </w:r>
+            <w:r>
+              <w:t>17/04/2026,</w:t>
+            </w:r>
+            <w:r>
+              <w:t xml:space="preserve"> </w:t>
+            </w:r>
+            <w:r>
+              <w:t>mas com horário alterado</w:t>
+            </w:r>
+          </w:p>
+        </w:tc>
+      </w:tr>
+      <w:tr>
+        <w:trPr>
+          <w:cnfStyle w:val="000000100000" w:firstRow="0" w:lastRow="0" w:firstColumn="0" w:lastColumn="0" w:oddVBand="0" w:evenVBand="0" w:oddHBand="1" w:evenHBand="0" w:firstRowFirstColumn="0" w:firstRowLastColumn="0" w:lastRowFirstColumn="0" w:lastRowLastColumn="0"/>
+          <w:trHeight w:val="317"/>
+        </w:trPr>
+        <w:tc>
+          <w:tcPr>
+            <w:cnfStyle w:val="001000000000" w:firstRow="0" w:lastRow="0" w:firstColumn="1" w:lastColumn="0" w:oddVBand="0" w:evenVBand="0" w:oddHBand="0" w:evenHBand="0" w:firstRowFirstColumn="0" w:firstRowLastColumn="0" w:lastRowFirstColumn="0" w:lastRowLastColumn="0"/>
+            <w:tcW w:w="0" w:type="auto"/>
+          </w:tcPr>
+          <w:p>
+            <w:pPr>
+              <w:jc w:val="both"/>
+            </w:pPr>
+            <w:r>
+              <w:t>RESULTADO OBTIDO</w:t>
+            </w:r>
+          </w:p>
+        </w:tc>
+        <w:tc>
+          <w:tcPr>
+            <w:tcW w:w="0" w:type="auto"/>
+          </w:tcPr>
+          <w:p>
+            <w:pPr>
+              <w:jc w:val="both"/>
+              <w:cnfStyle w:val="000000100000" w:firstRow="0" w:lastRow="0" w:firstColumn="0" w:lastColumn="0" w:oddVBand="0" w:evenVBand="0" w:oddHBand="1" w:evenHBand="0" w:firstRowFirstColumn="0" w:firstRowLastColumn="0" w:lastRowFirstColumn="0" w:lastRowLastColumn="0"/>
+            </w:pPr>
+            <w:r>
+              <w:t xml:space="preserve">Evento </w:t>
+            </w:r>
+            <w:r>
+              <w:t>foi remarcado</w:t>
+            </w:r>
+          </w:p>
+        </w:tc>
+      </w:tr>
+      <w:tr>
+        <w:trPr>
+          <w:trHeight w:val="317"/>
+        </w:trPr>
+        <w:tc>
+          <w:tcPr>
+            <w:cnfStyle w:val="001000000000" w:firstRow="0" w:lastRow="0" w:firstColumn="1" w:lastColumn="0" w:oddVBand="0" w:evenVBand="0" w:oddHBand="0" w:evenHBand="0" w:firstRowFirstColumn="0" w:firstRowLastColumn="0" w:lastRowFirstColumn="0" w:lastRowLastColumn="0"/>
+            <w:tcW w:w="0" w:type="auto"/>
+          </w:tcPr>
+          <w:p>
+            <w:pPr>
+              <w:jc w:val="both"/>
+            </w:pPr>
+            <w:r>
+              <w:t>STATUS</w:t>
+            </w:r>
+          </w:p>
+        </w:tc>
+        <w:tc>
+          <w:tcPr>
+            <w:tcW w:w="0" w:type="auto"/>
+          </w:tcPr>
+          <w:p>
+            <w:pPr>
+              <w:jc w:val="both"/>
+              <w:cnfStyle w:val="000000000000" w:firstRow="0" w:lastRow="0" w:firstColumn="0" w:lastColumn="0" w:oddVBand="0" w:evenVBand="0" w:oddHBand="0" w:evenHBand="0" w:firstRowFirstColumn="0" w:firstRowLastColumn="0" w:lastRowFirstColumn="0" w:lastRowLastColumn="0"/>
+            </w:pPr>
+            <w:r>
+              <w:t>[x] passou</w:t>
+            </w:r>
+          </w:p>
+        </w:tc>
+      </w:tr>
+      <w:tr>
+        <w:trPr>
+          <w:cnfStyle w:val="000000100000" w:firstRow="0" w:lastRow="0" w:firstColumn="0" w:lastColumn="0" w:oddVBand="0" w:evenVBand="0" w:oddHBand="1" w:evenHBand="0" w:firstRowFirstColumn="0" w:firstRowLastColumn="0" w:lastRowFirstColumn="0" w:lastRowLastColumn="0"/>
+          <w:trHeight w:val="317"/>
+        </w:trPr>
+        <w:tc>
+          <w:tcPr>
+            <w:cnfStyle w:val="001000000000" w:firstRow="0" w:lastRow="0" w:firstColumn="1" w:lastColumn="0" w:oddVBand="0" w:evenVBand="0" w:oddHBand="0" w:evenHBand="0" w:firstRowFirstColumn="0" w:firstRowLastColumn="0" w:lastRowFirstColumn="0" w:lastRowLastColumn="0"/>
+            <w:tcW w:w="0" w:type="auto"/>
+          </w:tcPr>
+          <w:p>
+            <w:pPr>
+              <w:jc w:val="both"/>
+            </w:pPr>
+            <w:r>
+              <w:t>AMBIENTE</w:t>
+            </w:r>
+          </w:p>
+        </w:tc>
+        <w:tc>
+          <w:tcPr>
+            <w:tcW w:w="0" w:type="auto"/>
+          </w:tcPr>
+          <w:p>
+            <w:pPr>
+              <w:jc w:val="both"/>
+              <w:cnfStyle w:val="000000100000" w:firstRow="0" w:lastRow="0" w:firstColumn="0" w:lastColumn="0" w:oddVBand="0" w:evenVBand="0" w:oddHBand="1" w:evenHBand="0" w:firstRowFirstColumn="0" w:firstRowLastColumn="0" w:lastRowFirstColumn="0" w:lastRowLastColumn="0"/>
+            </w:pPr>
+            <w:r>
+              <w:t xml:space="preserve">Sistema operacional: Windows 11 Navegador: </w:t>
+            </w:r>
+            <w:r>
+              <w:t>Microsoft Edge</w:t>
+            </w:r>
+            <w:r>
+              <w:t xml:space="preserve"> </w:t>
+            </w:r>
+            <w:r>
+              <w:t>147.0.3912.60</w:t>
+            </w:r>
+            <w:r>
+              <w:t xml:space="preserve"> A</w:t>
+            </w:r>
+            <w:r>
+              <w:t xml:space="preserve">mbiente: </w:t>
+            </w:r>
+            <w:hyperlink r:id="rId7" w:history="1">
+              <w:r>
+                <w:rPr>
+                  <w:rStyle w:val="Hyperlink"/>
+                </w:rPr>
+                <w:t>Google Agenda - Semana de 12 de abril de 2026</w:t>
+              </w:r>
+            </w:hyperlink>
+          </w:p>
+        </w:tc>
+      </w:tr>
+      <w:tr>
+        <w:trPr>
+          <w:trHeight w:val="330"/>
+        </w:trPr>
+        <w:tc>
+          <w:tcPr>
+            <w:cnfStyle w:val="001000000000" w:firstRow="0" w:lastRow="0" w:firstColumn="1" w:lastColumn="0" w:oddVBand="0" w:evenVBand="0" w:oddHBand="0" w:evenHBand="0" w:firstRowFirstColumn="0" w:firstRowLastColumn="0" w:lastRowFirstColumn="0" w:lastRowLastColumn="0"/>
+            <w:tcW w:w="0" w:type="auto"/>
+          </w:tcPr>
+          <w:p>
+            <w:pPr>
+              <w:jc w:val="both"/>
+            </w:pPr>
+            <w:r>
+              <w:lastRenderedPageBreak/>
+              <w:t>EVICÊNCIAS</w:t>
+            </w:r>
+          </w:p>
+        </w:tc>
+        <w:tc>
+          <w:tcPr>
+            <w:tcW w:w="0" w:type="auto"/>
+          </w:tcPr>
+          <w:p>
+            <w:pPr>
+              <w:jc w:val="both"/>
+              <w:cnfStyle w:val="000000000000" w:firstRow="0" w:lastRow="0" w:firstColumn="0" w:lastColumn="0" w:oddVBand="0" w:evenVBand="0" w:oddHBand="0" w:evenHBand="0" w:firstRowFirstColumn="0" w:firstRowLastColumn="0" w:lastRowFirstColumn="0" w:lastRowLastColumn="0"/>
+            </w:pPr>
+            <w:r>
+              <w:drawing>
+                <wp:inline distT="0" distB="0" distL="0" distR="0" wp14:anchorId="463A48F8" wp14:editId="450E245D">
+                  <wp:extent cx="5400040" cy="2661285"/>
+                  <wp:effectExtent l="0" t="0" r="0" b="5715"/>
+                  <wp:docPr id="1843777009" name="Imagem 1"/>
+                  <wp:cNvGraphicFramePr>
+                    <a:graphicFrameLocks xmlns:a="http://schemas.openxmlformats.org/drawingml/2006/main" noChangeAspect="1"/>
+                  </wp:cNvGraphicFramePr>
+                  <a:graphic xmlns:a="http://schemas.openxmlformats.org/drawingml/2006/main">
+                    <a:graphicData uri="http://schemas.openxmlformats.org/drawingml/2006/picture">
+                      <pic:pic xmlns:pic="http://schemas.openxmlformats.org/drawingml/2006/picture">
+                        <pic:nvPicPr>
+                          <pic:cNvPr id="1843777009" name=""/>
+                          <pic:cNvPicPr/>
+                        </pic:nvPicPr>
+                        <pic:blipFill>
+                          <a:blip r:embed="rId8"/>
+                          <a:stretch>
+                            <a:fillRect/>
+                          </a:stretch>
+                        </pic:blipFill>
+                        <pic:spPr>
+                          <a:xfrm>
+                            <a:off x="0" y="0"/>
+                            <a:ext cx="5400040" cy="2661285"/>
+                          </a:xfrm>
+                          <a:prstGeom prst="rect">
+                            <a:avLst/>
+                          </a:prstGeom>
+                        </pic:spPr>
+                      </pic:pic>
+                    </a:graphicData>
+                  </a:graphic>
+                </wp:inline>
+              </w:drawing>
+            </w:r>
+          </w:p>
+        </w:tc>
+      </w:tr>
+      <w:tr>
+        <w:trPr>
+          <w:cnfStyle w:val="000000100000" w:firstRow="0" w:lastRow="0" w:firstColumn="0" w:lastColumn="0" w:oddVBand="0" w:evenVBand="0" w:oddHBand="1" w:evenHBand="0" w:firstRowFirstColumn="0" w:firstRowLastColumn="0" w:lastRowFirstColumn="0" w:lastRowLastColumn="0"/>
+          <w:trHeight w:val="317"/>
+        </w:trPr>
+        <w:tc>
+          <w:tcPr>
+            <w:cnfStyle w:val="001000000000" w:firstRow="0" w:lastRow="0" w:firstColumn="1" w:lastColumn="0" w:oddVBand="0" w:evenVBand="0" w:oddHBand="0" w:evenHBand="0" w:firstRowFirstColumn="0" w:firstRowLastColumn="0" w:lastRowFirstColumn="0" w:lastRowLastColumn="0"/>
+            <w:tcW w:w="0" w:type="auto"/>
+          </w:tcPr>
+          <w:p>
+            <w:pPr>
+              <w:jc w:val="both"/>
+            </w:pPr>
+            <w:r>
+              <w:t>USO DE IA</w:t>
+            </w:r>
+          </w:p>
+        </w:tc>
+        <w:tc>
+          <w:tcPr>
+            <w:tcW w:w="0" w:type="auto"/>
+          </w:tcPr>
+          <w:p>
+            <w:pPr>
+              <w:jc w:val="both"/>
+              <w:cnfStyle w:val="000000100000" w:firstRow="0" w:lastRow="0" w:firstColumn="0" w:lastColumn="0" w:oddVBand="0" w:evenVBand="0" w:oddHBand="1" w:evenHBand="0" w:firstRowFirstColumn="0" w:firstRowLastColumn="0" w:lastRowFirstColumn="0" w:lastRowLastColumn="0"/>
+            </w:pPr>
+            <w:r>
+              <w:t>Não</w:t>
+            </w:r>
+          </w:p>
+        </w:tc>
+      </w:tr>
+    </w:tbl>
+    <w:tbl>
+      <w:tblPr>
+        <w:tblStyle w:val="SimplesTabela1"/>
+        <w:tblpPr w:leftFromText="141" w:rightFromText="141" w:vertAnchor="text" w:horzAnchor="page" w:tblpX="1" w:tblpY="145"/>
+        <w:tblW w:w="13434" w:type="dxa"/>
+        <w:tblLook w:val="04A0" w:firstRow="1" w:lastRow="0" w:firstColumn="1" w:lastColumn="0" w:noHBand="0" w:noVBand="1"/>
+      </w:tblPr>
+      <w:tblGrid>
+        <w:gridCol w:w="2238"/>
+        <w:gridCol w:w="11196"/>
+      </w:tblGrid>
+      <w:tr>
+        <w:trPr>
+          <w:cnfStyle w:val="100000000000" w:firstRow="1" w:lastRow="0" w:firstColumn="0" w:lastColumn="0" w:oddVBand="0" w:evenVBand="0" w:oddHBand="0" w:evenHBand="0" w:firstRowFirstColumn="0" w:firstRowLastColumn="0" w:lastRowFirstColumn="0" w:lastRowLastColumn="0"/>
+          <w:trHeight w:val="317"/>
+        </w:trPr>
+        <w:tc>
+          <w:tcPr>
+            <w:cnfStyle w:val="001000000000" w:firstRow="0" w:lastRow="0" w:firstColumn="1" w:lastColumn="0" w:oddVBand="0" w:evenVBand="0" w:oddHBand="0" w:evenHBand="0" w:firstRowFirstColumn="0" w:firstRowLastColumn="0" w:lastRowFirstColumn="0" w:lastRowLastColumn="0"/>
+            <w:tcW w:w="0" w:type="auto"/>
+          </w:tcPr>
+          <w:p>
+            <w:pPr>
+              <w:jc w:val="both"/>
+            </w:pPr>
+            <w:r>
+              <w:t>ID</w:t>
+            </w:r>
+          </w:p>
+        </w:tc>
+        <w:tc>
+          <w:tcPr>
+            <w:tcW w:w="0" w:type="auto"/>
+          </w:tcPr>
+          <w:p>
+            <w:pPr>
+              <w:jc w:val="both"/>
+              <w:cnfStyle w:val="100000000000" w:firstRow="1" w:lastRow="0" w:firstColumn="0" w:lastColumn="0" w:oddVBand="0" w:evenVBand="0" w:oddHBand="0" w:evenHBand="0" w:firstRowFirstColumn="0" w:firstRowLastColumn="0" w:lastRowFirstColumn="0" w:lastRowLastColumn="0"/>
+            </w:pPr>
+            <w:r>
+              <w:t>CT 0</w:t>
+            </w:r>
+            <w:r>
+              <w:t>3</w:t>
+            </w:r>
+          </w:p>
+        </w:tc>
+      </w:tr>
+      <w:tr>
+        <w:trPr>
+          <w:cnfStyle w:val="000000100000" w:firstRow="0" w:lastRow="0" w:firstColumn="0" w:lastColumn="0" w:oddVBand="0" w:evenVBand="0" w:oddHBand="1" w:evenHBand="0" w:firstRowFirstColumn="0" w:firstRowLastColumn="0" w:lastRowFirstColumn="0" w:lastRowLastColumn="0"/>
+          <w:trHeight w:val="317"/>
+        </w:trPr>
+        <w:tc>
+          <w:tcPr>
+            <w:cnfStyle w:val="001000000000" w:firstRow="0" w:lastRow="0" w:firstColumn="1" w:lastColumn="0" w:oddVBand="0" w:evenVBand="0" w:oddHBand="0" w:evenHBand="0" w:firstRowFirstColumn="0" w:firstRowLastColumn="0" w:lastRowFirstColumn="0" w:lastRowLastColumn="0"/>
+            <w:tcW w:w="0" w:type="auto"/>
+          </w:tcPr>
+          <w:p>
+            <w:pPr>
+              <w:jc w:val="both"/>
+            </w:pPr>
+            <w:r>
+              <w:t>TÍTULO</w:t>
+            </w:r>
+          </w:p>
+        </w:tc>
+        <w:tc>
+          <w:tcPr>
+            <w:tcW w:w="0" w:type="auto"/>
+          </w:tcPr>
+          <w:p>
+            <w:pPr>
+              <w:jc w:val="both"/>
+              <w:cnfStyle w:val="000000100000" w:firstRow="0" w:lastRow="0" w:firstColumn="0" w:lastColumn="0" w:oddVBand="0" w:evenVBand="0" w:oddHBand="1" w:evenHBand="0" w:firstRowFirstColumn="0" w:firstRowLastColumn="0" w:lastRowFirstColumn="0" w:lastRowLastColumn="0"/>
+            </w:pPr>
+            <w:r>
+              <w:t>EXCLUSÃO DE EVENTO EXISTENTE</w:t>
+            </w:r>
+            <w:r>
+              <w:t xml:space="preserve"> COM SUCESSO</w:t>
+            </w:r>
+          </w:p>
+        </w:tc>
+      </w:tr>
+      <w:tr>
+        <w:trPr>
+          <w:trHeight w:val="330"/>
+        </w:trPr>
+        <w:tc>
+          <w:tcPr>
+            <w:cnfStyle w:val="001000000000" w:firstRow="0" w:lastRow="0" w:firstColumn="1" w:lastColumn="0" w:oddVBand="0" w:evenVBand="0" w:oddHBand="0" w:evenHBand="0" w:firstRowFirstColumn="0" w:firstRowLastColumn="0" w:lastRowFirstColumn="0" w:lastRowLastColumn="0"/>
+            <w:tcW w:w="0" w:type="auto"/>
+          </w:tcPr>
+          <w:p>
+            <w:pPr>
+              <w:jc w:val="both"/>
+            </w:pPr>
+            <w:r>
+              <w:t>FUNCIONALIDADE</w:t>
+            </w:r>
+          </w:p>
+        </w:tc>
+        <w:tc>
+          <w:tcPr>
+            <w:tcW w:w="0" w:type="auto"/>
+          </w:tcPr>
+          <w:p>
+            <w:pPr>
+              <w:jc w:val="both"/>
+              <w:cnfStyle w:val="000000000000" w:firstRow="0" w:lastRow="0" w:firstColumn="0" w:lastColumn="0" w:oddVBand="0" w:evenVBand="0" w:oddHBand="0" w:evenHBand="0" w:firstRowFirstColumn="0" w:firstRowLastColumn="0" w:lastRowFirstColumn="0" w:lastRowLastColumn="0"/>
+            </w:pPr>
+            <w:r>
+              <w:t>GOOGLE AGENDA</w:t>
+            </w:r>
+            <w:r>
+              <w:t xml:space="preserve"> </w:t>
+            </w:r>
+            <w:r>
+              <w:t>–</w:t>
+            </w:r>
+            <w:r>
+              <w:t xml:space="preserve"> </w:t>
+            </w:r>
+            <w:r>
+              <w:t>EXCLUIR EVENTO</w:t>
+            </w:r>
+          </w:p>
+        </w:tc>
+      </w:tr>
+      <w:tr>
+        <w:trPr>
+          <w:cnfStyle w:val="000000100000" w:firstRow="0" w:lastRow="0" w:firstColumn="0" w:lastColumn="0" w:oddVBand="0" w:evenVBand="0" w:oddHBand="1" w:evenHBand="0" w:firstRowFirstColumn="0" w:firstRowLastColumn="0" w:lastRowFirstColumn="0" w:lastRowLastColumn="0"/>
+          <w:trHeight w:val="317"/>
+        </w:trPr>
+        <w:tc>
+          <w:tcPr>
+            <w:cnfStyle w:val="001000000000" w:firstRow="0" w:lastRow="0" w:firstColumn="1" w:lastColumn="0" w:oddVBand="0" w:evenVBand="0" w:oddHBand="0" w:evenHBand="0" w:firstRowFirstColumn="0" w:firstRowLastColumn="0" w:lastRowFirstColumn="0" w:lastRowLastColumn="0"/>
+            <w:tcW w:w="0" w:type="auto"/>
+          </w:tcPr>
+          <w:p>
+            <w:pPr>
+              <w:jc w:val="both"/>
+            </w:pPr>
+            <w:r>
+              <w:t>PRÉ-CONDIÇÕES</w:t>
+            </w:r>
+          </w:p>
+        </w:tc>
+        <w:tc>
+          <w:tcPr>
+            <w:tcW w:w="0" w:type="auto"/>
+          </w:tcPr>
+          <w:p>
+            <w:pPr>
+              <w:jc w:val="both"/>
+              <w:cnfStyle w:val="000000100000" w:firstRow="0" w:lastRow="0" w:firstColumn="0" w:lastColumn="0" w:oddVBand="0" w:evenVBand="0" w:oddHBand="1" w:evenHBand="0" w:firstRowFirstColumn="0" w:firstRowLastColumn="0" w:lastRowFirstColumn="0" w:lastRowLastColumn="0"/>
+            </w:pPr>
+            <w:r>
+              <w:t>1 - Usuário estar logado no sistema. 2- A tela de agenda estar aberta. 3- Localizar o evento que o usuário deseja excluir</w:t>
+            </w:r>
+          </w:p>
+        </w:tc>
+      </w:tr>
+      <w:tr>
+        <w:trPr>
+          <w:trHeight w:val="317"/>
+        </w:trPr>
+        <w:tc>
+          <w:tcPr>
+            <w:cnfStyle w:val="001000000000" w:firstRow="0" w:lastRow="0" w:firstColumn="1" w:lastColumn="0" w:oddVBand="0" w:evenVBand="0" w:oddHBand="0" w:evenHBand="0" w:firstRowFirstColumn="0" w:firstRowLastColumn="0" w:lastRowFirstColumn="0" w:lastRowLastColumn="0"/>
+            <w:tcW w:w="0" w:type="auto"/>
+          </w:tcPr>
+          <w:p>
+            <w:pPr>
+              <w:jc w:val="both"/>
+            </w:pPr>
+            <w:r>
+              <w:t>PASSOS</w:t>
+            </w:r>
+          </w:p>
+        </w:tc>
+        <w:tc>
+          <w:tcPr>
+            <w:tcW w:w="0" w:type="auto"/>
+          </w:tcPr>
+          <w:p>
+            <w:pPr>
+              <w:jc w:val="both"/>
+              <w:cnfStyle w:val="000000000000" w:firstRow="0" w:lastRow="0" w:firstColumn="0" w:lastColumn="0" w:oddVBand="0" w:evenVBand="0" w:oddHBand="0" w:evenHBand="0" w:firstRowFirstColumn="0" w:firstRowLastColumn="0" w:lastRowFirstColumn="0" w:lastRowLastColumn="0"/>
+            </w:pPr>
+            <w:r>
+              <w:t xml:space="preserve">1 – Localizar o Evento principal agendado para o dia 17/04/2026 às 1:30 pm. 2 - Clicar no evento “Evento principal” e localizar a lixeira e clicar. </w:t>
+            </w:r>
+          </w:p>
+        </w:tc>
+      </w:tr>
+      <w:tr>
+        <w:trPr>
+          <w:cnfStyle w:val="000000100000" w:firstRow="0" w:lastRow="0" w:firstColumn="0" w:lastColumn="0" w:oddVBand="0" w:evenVBand="0" w:oddHBand="1" w:evenHBand="0" w:firstRowFirstColumn="0" w:firstRowLastColumn="0" w:lastRowFirstColumn="0" w:lastRowLastColumn="0"/>
+          <w:trHeight w:val="317"/>
+        </w:trPr>
+        <w:tc>
+          <w:tcPr>
+            <w:cnfStyle w:val="001000000000" w:firstRow="0" w:lastRow="0" w:firstColumn="1" w:lastColumn="0" w:oddVBand="0" w:evenVBand="0" w:oddHBand="0" w:evenHBand="0" w:firstRowFirstColumn="0" w:firstRowLastColumn="0" w:lastRowFirstColumn="0" w:lastRowLastColumn="0"/>
+            <w:tcW w:w="0" w:type="auto"/>
+          </w:tcPr>
+          <w:p>
+            <w:pPr>
+              <w:jc w:val="both"/>
+            </w:pPr>
+            <w:r>
+              <w:t>DADOS DE ENTRADA</w:t>
+            </w:r>
+          </w:p>
+        </w:tc>
+        <w:tc>
+          <w:tcPr>
+            <w:tcW w:w="0" w:type="auto"/>
+          </w:tcPr>
+          <w:p>
+            <w:pPr>
+              <w:jc w:val="both"/>
+              <w:cnfStyle w:val="000000100000" w:firstRow="0" w:lastRow="0" w:firstColumn="0" w:lastColumn="0" w:oddVBand="0" w:evenVBand="0" w:oddHBand="1" w:evenHBand="0" w:firstRowFirstColumn="0" w:firstRowLastColumn="0" w:lastRowFirstColumn="0" w:lastRowLastColumn="0"/>
+            </w:pPr>
+            <w:r>
+              <w:t>Nenhum dado é passado ao sistema</w:t>
+            </w:r>
+          </w:p>
+        </w:tc>
+      </w:tr>
+      <w:tr>
+        <w:trPr>
+          <w:trHeight w:val="330"/>
+        </w:trPr>
+        <w:tc>
+          <w:tcPr>
+            <w:cnfStyle w:val="001000000000" w:firstRow="0" w:lastRow="0" w:firstColumn="1" w:lastColumn="0" w:oddVBand="0" w:evenVBand="0" w:oddHBand="0" w:evenHBand="0" w:firstRowFirstColumn="0" w:firstRowLastColumn="0" w:lastRowFirstColumn="0" w:lastRowLastColumn="0"/>
+            <w:tcW w:w="0" w:type="auto"/>
+          </w:tcPr>
+          <w:p>
+            <w:pPr>
+              <w:jc w:val="both"/>
+            </w:pPr>
+            <w:r>
+              <w:t>RESULTADO ESPERADO</w:t>
+            </w:r>
+          </w:p>
+        </w:tc>
+        <w:tc>
+          <w:tcPr>
+            <w:tcW w:w="0" w:type="auto"/>
+          </w:tcPr>
+          <w:p>
+            <w:pPr>
+              <w:jc w:val="both"/>
+              <w:cnfStyle w:val="000000000000" w:firstRow="0" w:lastRow="0" w:firstColumn="0" w:lastColumn="0" w:oddVBand="0" w:evenVBand="0" w:oddHBand="0" w:evenHBand="0" w:firstRowFirstColumn="0" w:firstRowLastColumn="0" w:lastRowFirstColumn="0" w:lastRowLastColumn="0"/>
+            </w:pPr>
+            <w:r>
+              <w:t>O evento é excluído com sucesso</w:t>
+            </w:r>
+          </w:p>
+        </w:tc>
+      </w:tr>
+      <w:tr>
+        <w:trPr>
+          <w:cnfStyle w:val="000000100000" w:firstRow="0" w:lastRow="0" w:firstColumn="0" w:lastColumn="0" w:oddVBand="0" w:evenVBand="0" w:oddHBand="1" w:evenHBand="0" w:firstRowFirstColumn="0" w:firstRowLastColumn="0" w:lastRowFirstColumn="0" w:lastRowLastColumn="0"/>
+          <w:trHeight w:val="317"/>
+        </w:trPr>
+        <w:tc>
+          <w:tcPr>
+            <w:cnfStyle w:val="001000000000" w:firstRow="0" w:lastRow="0" w:firstColumn="1" w:lastColumn="0" w:oddVBand="0" w:evenVBand="0" w:oddHBand="0" w:evenHBand="0" w:firstRowFirstColumn="0" w:firstRowLastColumn="0" w:lastRowFirstColumn="0" w:lastRowLastColumn="0"/>
+            <w:tcW w:w="0" w:type="auto"/>
+          </w:tcPr>
+          <w:p>
+            <w:pPr>
+              <w:jc w:val="both"/>
+            </w:pPr>
+            <w:r>
+              <w:t>RESULTADO OBTIDO</w:t>
+            </w:r>
+          </w:p>
+        </w:tc>
+        <w:tc>
+          <w:tcPr>
+            <w:tcW w:w="0" w:type="auto"/>
+          </w:tcPr>
+          <w:p>
+            <w:pPr>
+              <w:jc w:val="both"/>
+              <w:cnfStyle w:val="000000100000" w:firstRow="0" w:lastRow="0" w:firstColumn="0" w:lastColumn="0" w:oddVBand="0" w:evenVBand="0" w:oddHBand="1" w:evenHBand="0" w:firstRowFirstColumn="0" w:firstRowLastColumn="0" w:lastRowFirstColumn="0" w:lastRowLastColumn="0"/>
+            </w:pPr>
+            <w:r>
+              <w:t xml:space="preserve">Evento </w:t>
+            </w:r>
+            <w:r>
+              <w:t>excluído</w:t>
+            </w:r>
+          </w:p>
+        </w:tc>
+      </w:tr>
+      <w:tr>
+        <w:trPr>
+          <w:trHeight w:val="317"/>
+        </w:trPr>
+        <w:tc>
+          <w:tcPr>
+            <w:cnfStyle w:val="001000000000" w:firstRow="0" w:lastRow="0" w:firstColumn="1" w:lastColumn="0" w:oddVBand="0" w:evenVBand="0" w:oddHBand="0" w:evenHBand="0" w:firstRowFirstColumn="0" w:firstRowLastColumn="0" w:lastRowFirstColumn="0" w:lastRowLastColumn="0"/>
+            <w:tcW w:w="0" w:type="auto"/>
+          </w:tcPr>
+          <w:p>
+            <w:pPr>
+              <w:jc w:val="both"/>
+            </w:pPr>
+            <w:r>
+              <w:t>STATUS</w:t>
+            </w:r>
+          </w:p>
+        </w:tc>
+        <w:tc>
+          <w:tcPr>
+            <w:tcW w:w="0" w:type="auto"/>
+          </w:tcPr>
+          <w:p>
+            <w:pPr>
+              <w:jc w:val="both"/>
+              <w:cnfStyle w:val="000000000000" w:firstRow="0" w:lastRow="0" w:firstColumn="0" w:lastColumn="0" w:oddVBand="0" w:evenVBand="0" w:oddHBand="0" w:evenHBand="0" w:firstRowFirstColumn="0" w:firstRowLastColumn="0" w:lastRowFirstColumn="0" w:lastRowLastColumn="0"/>
+            </w:pPr>
+            <w:r>
+              <w:t>[x] passou</w:t>
+            </w:r>
+          </w:p>
+        </w:tc>
+      </w:tr>
+      <w:tr>
+        <w:trPr>
+          <w:cnfStyle w:val="000000100000" w:firstRow="0" w:lastRow="0" w:firstColumn="0" w:lastColumn="0" w:oddVBand="0" w:evenVBand="0" w:oddHBand="1" w:evenHBand="0" w:firstRowFirstColumn="0" w:firstRowLastColumn="0" w:lastRowFirstColumn="0" w:lastRowLastColumn="0"/>
+          <w:trHeight w:val="317"/>
+        </w:trPr>
+        <w:tc>
+          <w:tcPr>
+            <w:cnfStyle w:val="001000000000" w:firstRow="0" w:lastRow="0" w:firstColumn="1" w:lastColumn="0" w:oddVBand="0" w:evenVBand="0" w:oddHBand="0" w:evenHBand="0" w:firstRowFirstColumn="0" w:firstRowLastColumn="0" w:lastRowFirstColumn="0" w:lastRowLastColumn="0"/>
+            <w:tcW w:w="0" w:type="auto"/>
+          </w:tcPr>
+          <w:p>
+            <w:pPr>
+              <w:jc w:val="both"/>
+            </w:pPr>
+            <w:r>
+              <w:t>AMBIENTE</w:t>
+            </w:r>
+          </w:p>
+        </w:tc>
+        <w:tc>
+          <w:tcPr>
+            <w:tcW w:w="0" w:type="auto"/>
+          </w:tcPr>
+          <w:p>
+            <w:pPr>
+              <w:jc w:val="both"/>
+              <w:cnfStyle w:val="000000100000" w:firstRow="0" w:lastRow="0" w:firstColumn="0" w:lastColumn="0" w:oddVBand="0" w:evenVBand="0" w:oddHBand="1" w:evenHBand="0" w:firstRowFirstColumn="0" w:firstRowLastColumn="0" w:lastRowFirstColumn="0" w:lastRowLastColumn="0"/>
+            </w:pPr>
+            <w:r>
+              <w:t xml:space="preserve">Sistema operacional: Windows 11 Navegador: </w:t>
+            </w:r>
+            <w:r>
+              <w:t xml:space="preserve">Microsoft Edge </w:t>
+            </w:r>
+            <w:r>
+              <w:t>147.0.3912.60</w:t>
+            </w:r>
+            <w:r>
+              <w:t xml:space="preserve"> A</w:t>
+            </w:r>
+            <w:r>
+              <w:t xml:space="preserve">mbiente: </w:t>
+            </w:r>
+            <w:hyperlink r:id="rId9" w:history="1">
+              <w:r>
+                <w:rPr>
+                  <w:rStyle w:val="Hyperlink"/>
+                </w:rPr>
+                <w:t>Google Agenda - Semana de 12 de abril de 2026</w:t>
+              </w:r>
+            </w:hyperlink>
+          </w:p>
+        </w:tc>
+      </w:tr>
+      <w:tr>
+        <w:trPr>
+          <w:trHeight w:val="330"/>
+        </w:trPr>
+        <w:tc>
+          <w:tcPr>
+            <w:cnfStyle w:val="001000000000" w:firstRow="0" w:lastRow="0" w:firstColumn="1" w:lastColumn="0" w:oddVBand="0" w:evenVBand="0" w:oddHBand="0" w:evenHBand="0" w:firstRowFirstColumn="0" w:firstRowLastColumn="0" w:lastRowFirstColumn="0" w:lastRowLastColumn="0"/>
+            <w:tcW w:w="0" w:type="auto"/>
+          </w:tcPr>
+          <w:p>
+            <w:pPr>
+              <w:jc w:val="both"/>
+            </w:pPr>
+            <w:r>
+              <w:lastRenderedPageBreak/>
+              <w:t>EVICÊNCIAS</w:t>
+            </w:r>
+          </w:p>
+        </w:tc>
+        <w:tc>
+          <w:tcPr>
+            <w:tcW w:w="0" w:type="auto"/>
+          </w:tcPr>
+          <w:p>
+            <w:pPr>
+              <w:jc w:val="both"/>
+              <w:cnfStyle w:val="000000000000" w:firstRow="0" w:lastRow="0" w:firstColumn="0" w:lastColumn="0" w:oddVBand="0" w:evenVBand="0" w:oddHBand="0" w:evenHBand="0" w:firstRowFirstColumn="0" w:firstRowLastColumn="0" w:lastRowFirstColumn="0" w:lastRowLastColumn="0"/>
+            </w:pPr>
+            <w:r>
+              <w:drawing>
+                <wp:inline distT="0" distB="0" distL="0" distR="0" wp14:anchorId="654393A1" wp14:editId="6C8379AD">
+                  <wp:extent cx="6964680" cy="3655695"/>
+                  <wp:effectExtent l="0" t="0" r="7620" b="1905"/>
+                  <wp:docPr id="160848671" name="Imagem 1"/>
+                  <wp:cNvGraphicFramePr>
+                    <a:graphicFrameLocks xmlns:a="http://schemas.openxmlformats.org/drawingml/2006/main" noChangeAspect="1"/>
+                  </wp:cNvGraphicFramePr>
+                  <a:graphic xmlns:a="http://schemas.openxmlformats.org/drawingml/2006/main">
+                    <a:graphicData uri="http://schemas.openxmlformats.org/drawingml/2006/picture">
+                      <pic:pic xmlns:pic="http://schemas.openxmlformats.org/drawingml/2006/picture">
+                        <pic:nvPicPr>
+                          <pic:cNvPr id="160848671" name=""/>
+                          <pic:cNvPicPr/>
+                        </pic:nvPicPr>
+                        <pic:blipFill>
+                          <a:blip r:embed="rId10"/>
+                          <a:stretch>
+                            <a:fillRect/>
+                          </a:stretch>
+                        </pic:blipFill>
+                        <pic:spPr>
+                          <a:xfrm>
+                            <a:off x="0" y="0"/>
+                            <a:ext cx="6964680" cy="3655695"/>
+                          </a:xfrm>
+                          <a:prstGeom prst="rect">
+                            <a:avLst/>
+                          </a:prstGeom>
+                        </pic:spPr>
+                      </pic:pic>
+                    </a:graphicData>
+                  </a:graphic>
+                </wp:inline>
+              </w:drawing>
+            </w:r>
+          </w:p>
+        </w:tc>
+      </w:tr>
+      <w:tr>
+        <w:trPr>
+          <w:cnfStyle w:val="000000100000" w:firstRow="0" w:lastRow="0" w:firstColumn="0" w:lastColumn="0" w:oddVBand="0" w:evenVBand="0" w:oddHBand="1" w:evenHBand="0" w:firstRowFirstColumn="0" w:firstRowLastColumn="0" w:lastRowFirstColumn="0" w:lastRowLastColumn="0"/>
+          <w:trHeight w:val="317"/>
+        </w:trPr>
+        <w:tc>
+          <w:tcPr>
+            <w:cnfStyle w:val="001000000000" w:firstRow="0" w:lastRow="0" w:firstColumn="1" w:lastColumn="0" w:oddVBand="0" w:evenVBand="0" w:oddHBand="0" w:evenHBand="0" w:firstRowFirstColumn="0" w:firstRowLastColumn="0" w:lastRowFirstColumn="0" w:lastRowLastColumn="0"/>
+            <w:tcW w:w="0" w:type="auto"/>
+          </w:tcPr>
+          <w:p>
+            <w:pPr>
+              <w:jc w:val="both"/>
+            </w:pPr>
+            <w:r>
+              <w:t>USO DE IA</w:t>
+            </w:r>
+          </w:p>
+        </w:tc>
+        <w:tc>
+          <w:tcPr>
+            <w:tcW w:w="0" w:type="auto"/>
+          </w:tcPr>
+          <w:p>
+            <w:pPr>
+              <w:jc w:val="both"/>
+              <w:cnfStyle w:val="000000100000" w:firstRow="0" w:lastRow="0" w:firstColumn="0" w:lastColumn="0" w:oddVBand="0" w:evenVBand="0" w:oddHBand="1" w:evenHBand="0" w:firstRowFirstColumn="0" w:firstRowLastColumn="0" w:lastRowFirstColumn="0" w:lastRowLastColumn="0"/>
+            </w:pPr>
+            <w:r>
+              <w:t>Não</w:t>
+            </w:r>
+          </w:p>
+        </w:tc>
+      </w:tr>
+    </w:tbl>
+    <w:p>
+      <w:pPr>
+        <w:jc w:val="both"/>
+      </w:pPr>
+    </w:p>
+    <w:tbl>
+      <w:tblPr>
+        <w:tblStyle w:val="SimplesTabela1"/>
+        <w:tblpPr w:leftFromText="141" w:rightFromText="141" w:vertAnchor="text" w:horzAnchor="margin" w:tblpXSpec="center" w:tblpY="474"/>
+        <w:tblW w:w="11742" w:type="dxa"/>
+        <w:tblLook w:val="04A0" w:firstRow="1" w:lastRow="0" w:firstColumn="1" w:lastColumn="0" w:noHBand="0" w:noVBand="1"/>
+      </w:tblPr>
+      <w:tblGrid>
+        <w:gridCol w:w="2238"/>
+        <w:gridCol w:w="10512"/>
+      </w:tblGrid>
+      <w:tr>
+        <w:trPr>
+          <w:cnfStyle w:val="100000000000" w:firstRow="1" w:lastRow="0" w:firstColumn="0" w:lastColumn="0" w:oddVBand="0" w:evenVBand="0" w:oddHBand="0" w:evenHBand="0" w:firstRowFirstColumn="0" w:firstRowLastColumn="0" w:lastRowFirstColumn="0" w:lastRowLastColumn="0"/>
+          <w:trHeight w:val="309"/>
+        </w:trPr>
+        <w:tc>
+          <w:tcPr>
+            <w:cnfStyle w:val="001000000000" w:firstRow="0" w:lastRow="0" w:firstColumn="1" w:lastColumn="0" w:oddVBand="0" w:evenVBand="0" w:oddHBand="0" w:evenHBand="0" w:firstRowFirstColumn="0" w:firstRowLastColumn="0" w:lastRowFirstColumn="0" w:lastRowLastColumn="0"/>
+            <w:tcW w:w="0" w:type="auto"/>
+          </w:tcPr>
+          <w:p>
+            <w:pPr>
+              <w:jc w:val="both"/>
+            </w:pPr>
+            <w:r>
+              <w:t>ID</w:t>
+            </w:r>
+          </w:p>
+        </w:tc>
+        <w:tc>
+          <w:tcPr>
+            <w:tcW w:w="0" w:type="auto"/>
+          </w:tcPr>
+          <w:p>
+            <w:pPr>
+              <w:jc w:val="both"/>
+              <w:cnfStyle w:val="100000000000" w:firstRow="1" w:lastRow="0" w:firstColumn="0" w:lastColumn="0" w:oddVBand="0" w:evenVBand="0" w:oddHBand="0" w:evenHBand="0" w:firstRowFirstColumn="0" w:firstRowLastColumn="0" w:lastRowFirstColumn="0" w:lastRowLastColumn="0"/>
+            </w:pPr>
+            <w:r>
+              <w:t>CT 04</w:t>
+            </w:r>
+          </w:p>
+        </w:tc>
+      </w:tr>
+      <w:tr>
+        <w:trPr>
+          <w:cnfStyle w:val="000000100000" w:firstRow="0" w:lastRow="0" w:firstColumn="0" w:lastColumn="0" w:oddVBand="0" w:evenVBand="0" w:oddHBand="1" w:evenHBand="0" w:firstRowFirstColumn="0" w:firstRowLastColumn="0" w:lastRowFirstColumn="0" w:lastRowLastColumn="0"/>
+          <w:trHeight w:val="309"/>
+        </w:trPr>
+        <w:tc>
+          <w:tcPr>
+            <w:cnfStyle w:val="001000000000" w:firstRow="0" w:lastRow="0" w:firstColumn="1" w:lastColumn="0" w:oddVBand="0" w:evenVBand="0" w:oddHBand="0" w:evenHBand="0" w:firstRowFirstColumn="0" w:firstRowLastColumn="0" w:lastRowFirstColumn="0" w:lastRowLastColumn="0"/>
+            <w:tcW w:w="0" w:type="auto"/>
+          </w:tcPr>
+          <w:p>
+            <w:pPr>
+              <w:jc w:val="both"/>
+            </w:pPr>
+            <w:r>
+              <w:t>TÍTULO</w:t>
+            </w:r>
+          </w:p>
+        </w:tc>
+        <w:tc>
+          <w:tcPr>
+            <w:tcW w:w="0" w:type="auto"/>
+          </w:tcPr>
+          <w:p>
+            <w:pPr>
+              <w:jc w:val="both"/>
+              <w:cnfStyle w:val="000000100000" w:firstRow="0" w:lastRow="0" w:firstColumn="0" w:lastColumn="0" w:oddVBand="0" w:evenVBand="0" w:oddHBand="1" w:evenHBand="0" w:firstRowFirstColumn="0" w:firstRowLastColumn="0" w:lastRowFirstColumn="0" w:lastRowLastColumn="0"/>
+            </w:pPr>
+            <w:r>
+              <w:t>VISUALIAZAR EVENTOS DE ANIVERSÁRIO</w:t>
+            </w:r>
+          </w:p>
+        </w:tc>
+      </w:tr>
+      <w:tr>
+        <w:trPr>
+          <w:trHeight w:val="322"/>
+        </w:trPr>
+        <w:tc>
+          <w:tcPr>
+            <w:cnfStyle w:val="001000000000" w:firstRow="0" w:lastRow="0" w:firstColumn="1" w:lastColumn="0" w:oddVBand="0" w:evenVBand="0" w:oddHBand="0" w:evenHBand="0" w:firstRowFirstColumn="0" w:firstRowLastColumn="0" w:lastRowFirstColumn="0" w:lastRowLastColumn="0"/>
+            <w:tcW w:w="0" w:type="auto"/>
+          </w:tcPr>
+          <w:p>
+            <w:pPr>
+              <w:jc w:val="both"/>
+            </w:pPr>
+            <w:r>
+              <w:t>FUNCIONALIDADE</w:t>
+            </w:r>
+          </w:p>
+        </w:tc>
+        <w:tc>
+          <w:tcPr>
+            <w:tcW w:w="0" w:type="auto"/>
+          </w:tcPr>
+          <w:p>
+            <w:pPr>
+              <w:jc w:val="both"/>
+              <w:cnfStyle w:val="000000000000" w:firstRow="0" w:lastRow="0" w:firstColumn="0" w:lastColumn="0" w:oddVBand="0" w:evenVBand="0" w:oddHBand="0" w:evenHBand="0" w:firstRowFirstColumn="0" w:firstRowLastColumn="0" w:lastRowFirstColumn="0" w:lastRowLastColumn="0"/>
+            </w:pPr>
+            <w:r>
+              <w:t>GOOGLE AGENDA – VISUALIZAR EVENTO</w:t>
+            </w:r>
+          </w:p>
+        </w:tc>
+      </w:tr>
+      <w:tr>
+        <w:trPr>
+          <w:cnfStyle w:val="000000100000" w:firstRow="0" w:lastRow="0" w:firstColumn="0" w:lastColumn="0" w:oddVBand="0" w:evenVBand="0" w:oddHBand="1" w:evenHBand="0" w:firstRowFirstColumn="0" w:firstRowLastColumn="0" w:lastRowFirstColumn="0" w:lastRowLastColumn="0"/>
+          <w:trHeight w:val="309"/>
+        </w:trPr>
+        <w:tc>
+          <w:tcPr>
+            <w:cnfStyle w:val="001000000000" w:firstRow="0" w:lastRow="0" w:firstColumn="1" w:lastColumn="0" w:oddVBand="0" w:evenVBand="0" w:oddHBand="0" w:evenHBand="0" w:firstRowFirstColumn="0" w:firstRowLastColumn="0" w:lastRowFirstColumn="0" w:lastRowLastColumn="0"/>
+            <w:tcW w:w="0" w:type="auto"/>
+          </w:tcPr>
+          <w:p>
+            <w:pPr>
+              <w:jc w:val="both"/>
+            </w:pPr>
+            <w:r>
+              <w:t>PRÉ-CONDIÇÕES</w:t>
+            </w:r>
+          </w:p>
+        </w:tc>
+        <w:tc>
+          <w:tcPr>
+            <w:tcW w:w="0" w:type="auto"/>
+          </w:tcPr>
+          <w:p>
+            <w:pPr>
+              <w:jc w:val="both"/>
+              <w:cnfStyle w:val="000000100000" w:firstRow="0" w:lastRow="0" w:firstColumn="0" w:lastColumn="0" w:oddVBand="0" w:evenVBand="0" w:oddHBand="1" w:evenHBand="0" w:firstRowFirstColumn="0" w:firstRowLastColumn="0" w:lastRowFirstColumn="0" w:lastRowLastColumn="0"/>
+            </w:pPr>
+            <w:r>
+              <w:t xml:space="preserve">1 - Usuário estar logado no sistema. 2- A tela de agenda estar aberta. 3- Localizar </w:t>
+            </w:r>
+          </w:p>
+          <w:p>
+            <w:pPr>
+              <w:jc w:val="both"/>
+              <w:cnfStyle w:val="000000100000" w:firstRow="0" w:lastRow="0" w:firstColumn="0" w:lastColumn="0" w:oddVBand="0" w:evenVBand="0" w:oddHBand="1" w:evenHBand="0" w:firstRowFirstColumn="0" w:firstRowLastColumn="0" w:lastRowFirstColumn="0" w:lastRowLastColumn="0"/>
+            </w:pPr>
+            <w:r>
+              <w:t>na parte superior direita uma engrenagem</w:t>
+            </w:r>
+          </w:p>
+        </w:tc>
+      </w:tr>
+      <w:tr>
+        <w:trPr>
+          <w:trHeight w:val="309"/>
+        </w:trPr>
+        <w:tc>
+          <w:tcPr>
+            <w:cnfStyle w:val="001000000000" w:firstRow="0" w:lastRow="0" w:firstColumn="1" w:lastColumn="0" w:oddVBand="0" w:evenVBand="0" w:oddHBand="0" w:evenHBand="0" w:firstRowFirstColumn="0" w:firstRowLastColumn="0" w:lastRowFirstColumn="0" w:lastRowLastColumn="0"/>
+            <w:tcW w:w="0" w:type="auto"/>
+          </w:tcPr>
+          <w:p>
+            <w:pPr>
+              <w:jc w:val="both"/>
+            </w:pPr>
+            <w:r>
+              <w:t>PASSOS</w:t>
+            </w:r>
+          </w:p>
+        </w:tc>
+        <w:tc>
+          <w:tcPr>
+            <w:tcW w:w="0" w:type="auto"/>
+          </w:tcPr>
+          <w:p>
+            <w:pPr>
+              <w:jc w:val="both"/>
+              <w:cnfStyle w:val="000000000000" w:firstRow="0" w:lastRow="0" w:firstColumn="0" w:lastColumn="0" w:oddVBand="0" w:evenVBand="0" w:oddHBand="0" w:evenHBand="0" w:firstRowFirstColumn="0" w:firstRowLastColumn="0" w:lastRowFirstColumn="0" w:lastRowLastColumn="0"/>
+            </w:pPr>
+            <w:r>
+              <w:t>1 – Localizar ao lado da engrenagem onde está escrito “Agenda”</w:t>
+            </w:r>
+            <w:r>
+              <w:t xml:space="preserve"> </w:t>
+            </w:r>
+            <w:r>
+              <w:t>2 - Clicar em “Agenda” 3 – Modificar para ano. 4 – Localizar o dia do aniversário, nesse</w:t>
+            </w:r>
+            <w:r>
+              <w:t xml:space="preserve"> c</w:t>
+            </w:r>
+            <w:r>
+              <w:t xml:space="preserve">aso 04/08/2026. </w:t>
+            </w:r>
+          </w:p>
+        </w:tc>
+      </w:tr>
+      <w:tr>
+        <w:trPr>
+          <w:cnfStyle w:val="000000100000" w:firstRow="0" w:lastRow="0" w:firstColumn="0" w:lastColumn="0" w:oddVBand="0" w:evenVBand="0" w:oddHBand="1" w:evenHBand="0" w:firstRowFirstColumn="0" w:firstRowLastColumn="0" w:lastRowFirstColumn="0" w:lastRowLastColumn="0"/>
+          <w:trHeight w:val="309"/>
+        </w:trPr>
+        <w:tc>
+          <w:tcPr>
+            <w:cnfStyle w:val="001000000000" w:firstRow="0" w:lastRow="0" w:firstColumn="1" w:lastColumn="0" w:oddVBand="0" w:evenVBand="0" w:oddHBand="0" w:evenHBand="0" w:firstRowFirstColumn="0" w:firstRowLastColumn="0" w:lastRowFirstColumn="0" w:lastRowLastColumn="0"/>
+            <w:tcW w:w="0" w:type="auto"/>
+          </w:tcPr>
+          <w:p>
+            <w:pPr>
+              <w:jc w:val="both"/>
+            </w:pPr>
+            <w:r>
+              <w:t>DADOS DE ENTRADA</w:t>
+            </w:r>
+          </w:p>
+        </w:tc>
+        <w:tc>
+          <w:tcPr>
+            <w:tcW w:w="0" w:type="auto"/>
+          </w:tcPr>
+          <w:p>
+            <w:pPr>
+              <w:jc w:val="both"/>
+              <w:cnfStyle w:val="000000100000" w:firstRow="0" w:lastRow="0" w:firstColumn="0" w:lastColumn="0" w:oddVBand="0" w:evenVBand="0" w:oddHBand="1" w:evenHBand="0" w:firstRowFirstColumn="0" w:firstRowLastColumn="0" w:lastRowFirstColumn="0" w:lastRowLastColumn="0"/>
+            </w:pPr>
+            <w:r>
+              <w:t>Nenhum dado é passado ao sistema</w:t>
+            </w:r>
+          </w:p>
+        </w:tc>
+      </w:tr>
+      <w:tr>
+        <w:trPr>
+          <w:trHeight w:val="322"/>
+        </w:trPr>
+        <w:tc>
+          <w:tcPr>
+            <w:cnfStyle w:val="001000000000" w:firstRow="0" w:lastRow="0" w:firstColumn="1" w:lastColumn="0" w:oddVBand="0" w:evenVBand="0" w:oddHBand="0" w:evenHBand="0" w:firstRowFirstColumn="0" w:firstRowLastColumn="0" w:lastRowFirstColumn="0" w:lastRowLastColumn="0"/>
+            <w:tcW w:w="0" w:type="auto"/>
+          </w:tcPr>
+          <w:p>
+            <w:pPr>
+              <w:jc w:val="both"/>
+            </w:pPr>
+            <w:r>
+              <w:t>RESULTADO ESPERADO</w:t>
+            </w:r>
+          </w:p>
+        </w:tc>
+        <w:tc>
+          <w:tcPr>
+            <w:tcW w:w="0" w:type="auto"/>
+          </w:tcPr>
+          <w:p>
+            <w:pPr>
+              <w:jc w:val="both"/>
+              <w:cnfStyle w:val="000000000000" w:firstRow="0" w:lastRow="0" w:firstColumn="0" w:lastColumn="0" w:oddVBand="0" w:evenVBand="0" w:oddHBand="0" w:evenHBand="0" w:firstRowFirstColumn="0" w:firstRowLastColumn="0" w:lastRowFirstColumn="0" w:lastRowLastColumn="0"/>
+            </w:pPr>
+            <w:r>
+              <w:t xml:space="preserve">O evento </w:t>
+            </w:r>
+            <w:r>
+              <w:t>“Happy birthday” é mostrado</w:t>
+            </w:r>
+          </w:p>
+        </w:tc>
+      </w:tr>
+      <w:tr>
+        <w:trPr>
+          <w:cnfStyle w:val="000000100000" w:firstRow="0" w:lastRow="0" w:firstColumn="0" w:lastColumn="0" w:oddVBand="0" w:evenVBand="0" w:oddHBand="1" w:evenHBand="0" w:firstRowFirstColumn="0" w:firstRowLastColumn="0" w:lastRowFirstColumn="0" w:lastRowLastColumn="0"/>
+          <w:trHeight w:val="309"/>
+        </w:trPr>
+        <w:tc>
+          <w:tcPr>
+            <w:cnfStyle w:val="001000000000" w:firstRow="0" w:lastRow="0" w:firstColumn="1" w:lastColumn="0" w:oddVBand="0" w:evenVBand="0" w:oddHBand="0" w:evenHBand="0" w:firstRowFirstColumn="0" w:firstRowLastColumn="0" w:lastRowFirstColumn="0" w:lastRowLastColumn="0"/>
+            <w:tcW w:w="0" w:type="auto"/>
+          </w:tcPr>
+          <w:p>
+            <w:pPr>
+              <w:jc w:val="both"/>
+            </w:pPr>
+            <w:r>
+              <w:t>RESULTADO OBTIDO</w:t>
+            </w:r>
+          </w:p>
+        </w:tc>
+        <w:tc>
+          <w:tcPr>
+            <w:tcW w:w="0" w:type="auto"/>
+          </w:tcPr>
+          <w:p>
+            <w:pPr>
+              <w:jc w:val="both"/>
+              <w:cnfStyle w:val="000000100000" w:firstRow="0" w:lastRow="0" w:firstColumn="0" w:lastColumn="0" w:oddVBand="0" w:evenVBand="0" w:oddHBand="1" w:evenHBand="0" w:firstRowFirstColumn="0" w:firstRowLastColumn="0" w:lastRowFirstColumn="0" w:lastRowLastColumn="0"/>
+            </w:pPr>
+            <w:r>
+              <w:t xml:space="preserve">Evento </w:t>
+            </w:r>
+            <w:r>
+              <w:t>visualizado</w:t>
+            </w:r>
+          </w:p>
+        </w:tc>
+      </w:tr>
+      <w:tr>
+        <w:trPr>
+          <w:trHeight w:val="309"/>
+        </w:trPr>
+        <w:tc>
+          <w:tcPr>
+            <w:cnfStyle w:val="001000000000" w:firstRow="0" w:lastRow="0" w:firstColumn="1" w:lastColumn="0" w:oddVBand="0" w:evenVBand="0" w:oddHBand="0" w:evenHBand="0" w:firstRowFirstColumn="0" w:firstRowLastColumn="0" w:lastRowFirstColumn="0" w:lastRowLastColumn="0"/>
+            <w:tcW w:w="0" w:type="auto"/>
+          </w:tcPr>
+          <w:p>
+            <w:pPr>
+              <w:jc w:val="both"/>
+            </w:pPr>
+            <w:r>
+              <w:t>STATUS</w:t>
+            </w:r>
+          </w:p>
+        </w:tc>
+        <w:tc>
+          <w:tcPr>
+            <w:tcW w:w="0" w:type="auto"/>
+          </w:tcPr>
+          <w:p>
+            <w:pPr>
+              <w:jc w:val="both"/>
+              <w:cnfStyle w:val="000000000000" w:firstRow="0" w:lastRow="0" w:firstColumn="0" w:lastColumn="0" w:oddVBand="0" w:evenVBand="0" w:oddHBand="0" w:evenHBand="0" w:firstRowFirstColumn="0" w:firstRowLastColumn="0" w:lastRowFirstColumn="0" w:lastRowLastColumn="0"/>
+            </w:pPr>
+            <w:r>
+              <w:t>[x] passou</w:t>
+            </w:r>
+          </w:p>
+        </w:tc>
+      </w:tr>
+      <w:tr>
+        <w:trPr>
+          <w:cnfStyle w:val="000000100000" w:firstRow="0" w:lastRow="0" w:firstColumn="0" w:lastColumn="0" w:oddVBand="0" w:evenVBand="0" w:oddHBand="1" w:evenHBand="0" w:firstRowFirstColumn="0" w:firstRowLastColumn="0" w:lastRowFirstColumn="0" w:lastRowLastColumn="0"/>
+          <w:trHeight w:val="309"/>
+        </w:trPr>
+        <w:tc>
+          <w:tcPr>
+            <w:cnfStyle w:val="001000000000" w:firstRow="0" w:lastRow="0" w:firstColumn="1" w:lastColumn="0" w:oddVBand="0" w:evenVBand="0" w:oddHBand="0" w:evenHBand="0" w:firstRowFirstColumn="0" w:firstRowLastColumn="0" w:lastRowFirstColumn="0" w:lastRowLastColumn="0"/>
+            <w:tcW w:w="0" w:type="auto"/>
+          </w:tcPr>
+          <w:p>
+            <w:pPr>
+              <w:jc w:val="both"/>
+            </w:pPr>
+            <w:r>
+              <w:t>AMBIENTE</w:t>
+            </w:r>
+          </w:p>
+        </w:tc>
+        <w:tc>
+          <w:tcPr>
+            <w:tcW w:w="0" w:type="auto"/>
+          </w:tcPr>
+          <w:p>
+            <w:pPr>
+              <w:jc w:val="both"/>
+              <w:cnfStyle w:val="000000100000" w:firstRow="0" w:lastRow="0" w:firstColumn="0" w:lastColumn="0" w:oddVBand="0" w:evenVBand="0" w:oddHBand="1" w:evenHBand="0" w:firstRowFirstColumn="0" w:firstRowLastColumn="0" w:lastRowFirstColumn="0" w:lastRowLastColumn="0"/>
+            </w:pPr>
+            <w:r>
+              <w:t xml:space="preserve">Sistema operacional: Windows 11 Navegador: </w:t>
+            </w:r>
+            <w:r>
+              <w:t xml:space="preserve">Microsoft Edge </w:t>
+            </w:r>
+            <w:r>
+              <w:t>147.0.3912.60</w:t>
+            </w:r>
+            <w:r>
+              <w:t xml:space="preserve"> A</w:t>
+            </w:r>
+            <w:r>
+              <w:t xml:space="preserve">mbiente: </w:t>
+            </w:r>
+            <w:r>
+              <w:t xml:space="preserve"> </w:t>
+            </w:r>
+            <w:hyperlink r:id="rId11" w:history="1">
+              <w:r>
+                <w:rPr>
+                  <w:rStyle w:val="Hyperlink"/>
+                </w:rPr>
+                <w:t>Google Agenda - terça-feira, 4 de agosto de 2026</w:t>
+              </w:r>
+            </w:hyperlink>
+          </w:p>
+        </w:tc>
+      </w:tr>
+      <w:tr>
+        <w:trPr>
+          <w:trHeight w:val="322"/>
+        </w:trPr>
+        <w:tc>
+          <w:tcPr>
+            <w:cnfStyle w:val="001000000000" w:firstRow="0" w:lastRow="0" w:firstColumn="1" w:lastColumn="0" w:oddVBand="0" w:evenVBand="0" w:oddHBand="0" w:evenHBand="0" w:firstRowFirstColumn="0" w:firstRowLastColumn="0" w:lastRowFirstColumn="0" w:lastRowLastColumn="0"/>
+            <w:tcW w:w="0" w:type="auto"/>
+          </w:tcPr>
+          <w:p>
+            <w:pPr>
+              <w:jc w:val="both"/>
+            </w:pPr>
+            <w:r>
+              <w:lastRenderedPageBreak/>
+              <w:t>EVICÊNCIAS</w:t>
+            </w:r>
+          </w:p>
+        </w:tc>
+        <w:tc>
+          <w:tcPr>
+            <w:tcW w:w="0" w:type="auto"/>
+          </w:tcPr>
+          <w:p>
+            <w:pPr>
+              <w:jc w:val="both"/>
+              <w:cnfStyle w:val="000000000000" w:firstRow="0" w:lastRow="0" w:firstColumn="0" w:lastColumn="0" w:oddVBand="0" w:evenVBand="0" w:oddHBand="0" w:evenHBand="0" w:firstRowFirstColumn="0" w:firstRowLastColumn="0" w:lastRowFirstColumn="0" w:lastRowLastColumn="0"/>
+            </w:pPr>
+            <w:r>
+              <w:drawing>
+                <wp:inline distT="0" distB="0" distL="0" distR="0" wp14:anchorId="43C65FEB" wp14:editId="2C5A81EE">
+                  <wp:extent cx="6537960" cy="1402080"/>
+                  <wp:effectExtent l="0" t="0" r="0" b="7620"/>
+                  <wp:docPr id="1952898823" name="Imagem 1"/>
+                  <wp:cNvGraphicFramePr>
+                    <a:graphicFrameLocks xmlns:a="http://schemas.openxmlformats.org/drawingml/2006/main" noChangeAspect="1"/>
+                  </wp:cNvGraphicFramePr>
+                  <a:graphic xmlns:a="http://schemas.openxmlformats.org/drawingml/2006/main">
+                    <a:graphicData uri="http://schemas.openxmlformats.org/drawingml/2006/picture">
+                      <pic:pic xmlns:pic="http://schemas.openxmlformats.org/drawingml/2006/picture">
+                        <pic:nvPicPr>
+                          <pic:cNvPr id="1952898823" name=""/>
+                          <pic:cNvPicPr/>
+                        </pic:nvPicPr>
+                        <pic:blipFill>
+                          <a:blip r:embed="rId12"/>
+                          <a:stretch>
+                            <a:fillRect/>
+                          </a:stretch>
+                        </pic:blipFill>
+                        <pic:spPr>
+                          <a:xfrm>
+                            <a:off x="0" y="0"/>
+                            <a:ext cx="6537960" cy="1402080"/>
+                          </a:xfrm>
+                          <a:prstGeom prst="rect">
+                            <a:avLst/>
+                          </a:prstGeom>
+                        </pic:spPr>
+                      </pic:pic>
+                    </a:graphicData>
+                  </a:graphic>
+                </wp:inline>
+              </w:drawing>
+            </w:r>
+          </w:p>
+        </w:tc>
+      </w:tr>
+      <w:tr>
+        <w:trPr>
+          <w:cnfStyle w:val="000000100000" w:firstRow="0" w:lastRow="0" w:firstColumn="0" w:lastColumn="0" w:oddVBand="0" w:evenVBand="0" w:oddHBand="1" w:evenHBand="0" w:firstRowFirstColumn="0" w:firstRowLastColumn="0" w:lastRowFirstColumn="0" w:lastRowLastColumn="0"/>
+          <w:trHeight w:val="309"/>
+        </w:trPr>
+        <w:tc>
+          <w:tcPr>
+            <w:cnfStyle w:val="001000000000" w:firstRow="0" w:lastRow="0" w:firstColumn="1" w:lastColumn="0" w:oddVBand="0" w:evenVBand="0" w:oddHBand="0" w:evenHBand="0" w:firstRowFirstColumn="0" w:firstRowLastColumn="0" w:lastRowFirstColumn="0" w:lastRowLastColumn="0"/>
+            <w:tcW w:w="0" w:type="auto"/>
+          </w:tcPr>
+          <w:p>
+            <w:pPr>
+              <w:jc w:val="both"/>
+            </w:pPr>
+            <w:r>
+              <w:t>USO DE IA</w:t>
+            </w:r>
+          </w:p>
+        </w:tc>
+        <w:tc>
+          <w:tcPr>
+            <w:tcW w:w="0" w:type="auto"/>
+          </w:tcPr>
+          <w:p>
+            <w:pPr>
+              <w:jc w:val="both"/>
+              <w:cnfStyle w:val="000000100000" w:firstRow="0" w:lastRow="0" w:firstColumn="0" w:lastColumn="0" w:oddVBand="0" w:evenVBand="0" w:oddHBand="1" w:evenHBand="0" w:firstRowFirstColumn="0" w:firstRowLastColumn="0" w:lastRowFirstColumn="0" w:lastRowLastColumn="0"/>
+            </w:pPr>
+            <w:r>
+              <w:t>Não</w:t>
+            </w:r>
+          </w:p>
+        </w:tc>
+      </w:tr>
+    </w:tbl>
+    <w:p>
+      <w:pPr>
+        <w:jc w:val="both"/>
+      </w:pPr>
+    </w:p>
     <w:p>
       <w:pPr>
         <w:jc w:val="both"/>
@@ -1058,6 +2878,7 @@
   <w:style w:type="paragraph" w:default="1" w:styleId="Normal">
     <w:name w:val="Normal"/>
     <w:qFormat/>
+    <w:rsid w:val="00491284"/>
   </w:style>
   <w:style w:type="paragraph" w:styleId="Ttulo1">
     <w:name w:val="heading 1"/>
@@ -1261,7 +3082,6 @@
   <w:style w:type="character" w:default="1" w:styleId="Fontepargpadro">
     <w:name w:val="Default Paragraph Font"/>
     <w:uiPriority w:val="1"/>
-    <w:semiHidden/>
     <w:unhideWhenUsed/>
   </w:style>
   <w:style w:type="table" w:default="1" w:styleId="Tabelanormal">
@@ -1676,6 +3496,29 @@
       </w:tcPr>
     </w:tblStylePr>
   </w:style>
+  <w:style w:type="character" w:styleId="Hyperlink">
+    <w:name w:val="Hyperlink"/>
+    <w:basedOn w:val="Fontepargpadro"/>
+    <w:uiPriority w:val="99"/>
+    <w:unhideWhenUsed/>
+    <w:rsid w:val="00B816A1"/>
+    <w:rPr>
+      <w:color w:val="467886" w:themeColor="hyperlink"/>
+      <w:u w:val="single"/>
+    </w:rPr>
+  </w:style>
+  <w:style w:type="character" w:styleId="MenoPendente">
+    <w:name w:val="Unresolved Mention"/>
+    <w:basedOn w:val="Fontepargpadro"/>
+    <w:uiPriority w:val="99"/>
+    <w:semiHidden/>
+    <w:unhideWhenUsed/>
+    <w:rsid w:val="00B816A1"/>
+    <w:rPr>
+      <w:color w:val="605E5C"/>
+      <w:shd w:val="clear" w:color="auto" w:fill="E1DFDD"/>
+    </w:rPr>
+  </w:style>
 </w:styles>
 </file>
 

</xml_diff>